<commit_message>
Lab 2: Cos function
</commit_message>
<xml_diff>
--- a/Lab1/docs/report.docx
+++ b/Lab1/docs/report.docx
@@ -298,6 +298,7 @@
                 <w:lang w:val="en-US" w:eastAsia="ja-JP"/>
               </w:rPr>
             </w:pPr>
+            <w:proofErr w:type="spellStart"/>
             <w:r>
               <w:rPr>
                 <w:rFonts w:ascii="Times New Roman" w:hAnsi="Times New Roman" w:cs="Times New Roman"/>
@@ -307,8 +308,33 @@
                 <w:szCs w:val="24"/>
                 <w:lang w:val="en-US" w:eastAsia="ja-JP"/>
               </w:rPr>
-              <w:t>Нейротехнологии и программирование</w:t>
+              <w:t>Нейротехнологии</w:t>
             </w:r>
+            <w:proofErr w:type="spellEnd"/>
+            <w:r>
+              <w:rPr>
+                <w:rFonts w:ascii="Times New Roman" w:hAnsi="Times New Roman" w:cs="Times New Roman"/>
+                <w:b/>
+                <w:bCs/>
+                <w:sz w:val="24"/>
+                <w:szCs w:val="24"/>
+                <w:lang w:val="en-US" w:eastAsia="ja-JP"/>
+              </w:rPr>
+              <w:t xml:space="preserve"> и </w:t>
+            </w:r>
+            <w:proofErr w:type="spellStart"/>
+            <w:r>
+              <w:rPr>
+                <w:rFonts w:ascii="Times New Roman" w:hAnsi="Times New Roman" w:cs="Times New Roman"/>
+                <w:b/>
+                <w:bCs/>
+                <w:sz w:val="24"/>
+                <w:szCs w:val="24"/>
+                <w:lang w:val="en-US" w:eastAsia="ja-JP"/>
+              </w:rPr>
+              <w:t>программирование</w:t>
+            </w:r>
+            <w:proofErr w:type="spellEnd"/>
           </w:p>
         </w:tc>
       </w:tr>
@@ -392,6 +418,7 @@
                 <w:lang w:val="en-US" w:eastAsia="ja-JP"/>
               </w:rPr>
             </w:pPr>
+            <w:proofErr w:type="spellStart"/>
             <w:r>
               <w:rPr>
                 <w:rFonts w:ascii="Times New Roman" w:hAnsi="Times New Roman" w:cs="Times New Roman"/>
@@ -400,8 +427,53 @@
                 <w:szCs w:val="24"/>
                 <w:lang w:val="en-US" w:eastAsia="ja-JP"/>
               </w:rPr>
-              <w:t>Тестирование программного обеспечения</w:t>
+              <w:t>Тестирование</w:t>
             </w:r>
+            <w:proofErr w:type="spellEnd"/>
+            <w:r>
+              <w:rPr>
+                <w:rFonts w:ascii="Times New Roman" w:hAnsi="Times New Roman" w:cs="Times New Roman"/>
+                <w:b/>
+                <w:sz w:val="24"/>
+                <w:szCs w:val="24"/>
+                <w:lang w:val="en-US" w:eastAsia="ja-JP"/>
+              </w:rPr>
+              <w:t xml:space="preserve"> </w:t>
+            </w:r>
+            <w:proofErr w:type="spellStart"/>
+            <w:r>
+              <w:rPr>
+                <w:rFonts w:ascii="Times New Roman" w:hAnsi="Times New Roman" w:cs="Times New Roman"/>
+                <w:b/>
+                <w:sz w:val="24"/>
+                <w:szCs w:val="24"/>
+                <w:lang w:val="en-US" w:eastAsia="ja-JP"/>
+              </w:rPr>
+              <w:t>программного</w:t>
+            </w:r>
+            <w:proofErr w:type="spellEnd"/>
+            <w:r>
+              <w:rPr>
+                <w:rFonts w:ascii="Times New Roman" w:hAnsi="Times New Roman" w:cs="Times New Roman"/>
+                <w:b/>
+                <w:sz w:val="24"/>
+                <w:szCs w:val="24"/>
+                <w:lang w:val="en-US" w:eastAsia="ja-JP"/>
+              </w:rPr>
+              <w:t xml:space="preserve"> </w:t>
+            </w:r>
+            <w:proofErr w:type="spellStart"/>
+            <w:r>
+              <w:rPr>
+                <w:rFonts w:ascii="Times New Roman" w:hAnsi="Times New Roman" w:cs="Times New Roman"/>
+                <w:b/>
+                <w:sz w:val="24"/>
+                <w:szCs w:val="24"/>
+                <w:lang w:val="en-US" w:eastAsia="ja-JP"/>
+              </w:rPr>
+              <w:t>обеспечения</w:t>
+            </w:r>
+            <w:proofErr w:type="spellEnd"/>
           </w:p>
         </w:tc>
       </w:tr>
@@ -1046,11 +1118,14 @@
             <w:tabs>
               <w:tab w:val="right" w:leader="dot" w:pos="9019"/>
             </w:tabs>
-            <w:spacing w:line="360" w:lineRule="auto"/>
             <w:rPr>
-              <w:rFonts w:ascii="Times New Roman" w:hAnsi="Times New Roman" w:cs="Times New Roman"/>
+              <w:rFonts w:asciiTheme="minorHAnsi" w:hAnsiTheme="minorHAnsi" w:cstheme="minorBidi"/>
               <w:noProof/>
-              <w:lang w:val="en-US"/>
+              <w:kern w:val="2"/>
+              <w:sz w:val="24"/>
+              <w:szCs w:val="24"/>
+              <w:lang w:val="en-US" w:eastAsia="en-US"/>
+              <w14:ligatures w14:val="standardContextual"/>
             </w:rPr>
           </w:pPr>
           <w:r>
@@ -1080,7 +1155,17 @@
             </w:rPr>
             <w:fldChar w:fldCharType="separate"/>
           </w:r>
-          <w:hyperlink w:anchor="_Toc152985142" w:history="1">
+          <w:hyperlink w:anchor="_Toc221794996" w:history="1">
+            <w:r>
+              <w:rPr>
+                <w:rStyle w:val="Hyperlink"/>
+                <w:rFonts w:ascii="Times New Roman" w:hAnsi="Times New Roman" w:cs="Times New Roman"/>
+                <w:b/>
+                <w:noProof/>
+                <w:lang w:val="en-US"/>
+              </w:rPr>
+              <w:t xml:space="preserve">1. </w:t>
+            </w:r>
             <w:r>
               <w:rPr>
                 <w:rStyle w:val="Hyperlink"/>
@@ -1089,11 +1174,10 @@
                 <w:noProof/>
                 <w:lang w:val="ru-RU"/>
               </w:rPr>
-              <w:t>Задание:</w:t>
+              <w:t>Описание задания:</w:t>
             </w:r>
             <w:r>
               <w:rPr>
-                <w:rFonts w:ascii="Times New Roman" w:hAnsi="Times New Roman" w:cs="Times New Roman"/>
                 <w:noProof/>
                 <w:webHidden/>
               </w:rPr>
@@ -1101,7 +1185,6 @@
             </w:r>
             <w:r>
               <w:rPr>
-                <w:rFonts w:ascii="Times New Roman" w:hAnsi="Times New Roman" w:cs="Times New Roman"/>
                 <w:noProof/>
                 <w:webHidden/>
               </w:rPr>
@@ -1109,22 +1192,19 @@
             </w:r>
             <w:r>
               <w:rPr>
-                <w:rFonts w:ascii="Times New Roman" w:hAnsi="Times New Roman" w:cs="Times New Roman"/>
                 <w:noProof/>
                 <w:webHidden/>
               </w:rPr>
-              <w:instrText xml:space="preserve"> PAGEREF _Toc152985142 \h </w:instrText>
+              <w:instrText xml:space="preserve"> PAGEREF _Toc221794996 \h </w:instrText>
             </w:r>
             <w:r>
               <w:rPr>
-                <w:rFonts w:ascii="Times New Roman" w:hAnsi="Times New Roman" w:cs="Times New Roman"/>
                 <w:noProof/>
                 <w:webHidden/>
               </w:rPr>
             </w:r>
             <w:r>
               <w:rPr>
-                <w:rFonts w:ascii="Times New Roman" w:hAnsi="Times New Roman" w:cs="Times New Roman"/>
                 <w:noProof/>
                 <w:webHidden/>
               </w:rPr>
@@ -1132,7 +1212,6 @@
             </w:r>
             <w:r>
               <w:rPr>
-                <w:rFonts w:ascii="Times New Roman" w:hAnsi="Times New Roman" w:cs="Times New Roman"/>
                 <w:noProof/>
                 <w:webHidden/>
               </w:rPr>
@@ -1140,7 +1219,6 @@
             </w:r>
             <w:r>
               <w:rPr>
-                <w:rFonts w:ascii="Times New Roman" w:hAnsi="Times New Roman" w:cs="Times New Roman"/>
                 <w:noProof/>
                 <w:webHidden/>
               </w:rPr>
@@ -1154,14 +1232,27 @@
             <w:tabs>
               <w:tab w:val="right" w:leader="dot" w:pos="9019"/>
             </w:tabs>
-            <w:spacing w:line="360" w:lineRule="auto"/>
             <w:rPr>
-              <w:rFonts w:ascii="Times New Roman" w:hAnsi="Times New Roman" w:cs="Times New Roman"/>
+              <w:rFonts w:asciiTheme="minorHAnsi" w:hAnsiTheme="minorHAnsi" w:cstheme="minorBidi"/>
               <w:noProof/>
-              <w:lang w:val="en-US"/>
+              <w:kern w:val="2"/>
+              <w:sz w:val="24"/>
+              <w:szCs w:val="24"/>
+              <w:lang w:val="en-US" w:eastAsia="en-US"/>
+              <w14:ligatures w14:val="standardContextual"/>
             </w:rPr>
           </w:pPr>
-          <w:hyperlink w:anchor="_Toc152985143" w:history="1">
+          <w:hyperlink w:anchor="_Toc221794997" w:history="1">
+            <w:r>
+              <w:rPr>
+                <w:rStyle w:val="Hyperlink"/>
+                <w:rFonts w:ascii="Times New Roman" w:hAnsi="Times New Roman" w:cs="Times New Roman"/>
+                <w:b/>
+                <w:noProof/>
+                <w:lang w:val="en-US"/>
+              </w:rPr>
+              <w:t xml:space="preserve">2. </w:t>
+            </w:r>
             <w:r>
               <w:rPr>
                 <w:rStyle w:val="Hyperlink"/>
@@ -1170,11 +1261,10 @@
                 <w:noProof/>
                 <w:lang w:val="ru-RU"/>
               </w:rPr>
-              <w:t>Диаграмма:</w:t>
+              <w:t>Выполнение:</w:t>
             </w:r>
             <w:r>
               <w:rPr>
-                <w:rFonts w:ascii="Times New Roman" w:hAnsi="Times New Roman" w:cs="Times New Roman"/>
                 <w:noProof/>
                 <w:webHidden/>
               </w:rPr>
@@ -1182,7 +1272,6 @@
             </w:r>
             <w:r>
               <w:rPr>
-                <w:rFonts w:ascii="Times New Roman" w:hAnsi="Times New Roman" w:cs="Times New Roman"/>
                 <w:noProof/>
                 <w:webHidden/>
               </w:rPr>
@@ -1190,22 +1279,19 @@
             </w:r>
             <w:r>
               <w:rPr>
-                <w:rFonts w:ascii="Times New Roman" w:hAnsi="Times New Roman" w:cs="Times New Roman"/>
                 <w:noProof/>
                 <w:webHidden/>
               </w:rPr>
-              <w:instrText xml:space="preserve"> PAGEREF _Toc152985143 \h </w:instrText>
+              <w:instrText xml:space="preserve"> PAGEREF _Toc221794997 \h </w:instrText>
             </w:r>
             <w:r>
               <w:rPr>
-                <w:rFonts w:ascii="Times New Roman" w:hAnsi="Times New Roman" w:cs="Times New Roman"/>
                 <w:noProof/>
                 <w:webHidden/>
               </w:rPr>
             </w:r>
             <w:r>
               <w:rPr>
-                <w:rFonts w:ascii="Times New Roman" w:hAnsi="Times New Roman" w:cs="Times New Roman"/>
                 <w:noProof/>
                 <w:webHidden/>
               </w:rPr>
@@ -1213,7 +1299,6 @@
             </w:r>
             <w:r>
               <w:rPr>
-                <w:rFonts w:ascii="Times New Roman" w:hAnsi="Times New Roman" w:cs="Times New Roman"/>
                 <w:noProof/>
                 <w:webHidden/>
               </w:rPr>
@@ -1221,7 +1306,283 @@
             </w:r>
             <w:r>
               <w:rPr>
+                <w:noProof/>
+                <w:webHidden/>
+              </w:rPr>
+              <w:fldChar w:fldCharType="end"/>
+            </w:r>
+          </w:hyperlink>
+        </w:p>
+        <w:p>
+          <w:pPr>
+            <w:pStyle w:val="TOC2"/>
+            <w:tabs>
+              <w:tab w:val="right" w:leader="dot" w:pos="9019"/>
+            </w:tabs>
+            <w:rPr>
+              <w:rFonts w:asciiTheme="minorHAnsi" w:hAnsiTheme="minorHAnsi" w:cstheme="minorBidi"/>
+              <w:noProof/>
+              <w:kern w:val="2"/>
+              <w:sz w:val="24"/>
+              <w:szCs w:val="24"/>
+              <w:lang w:val="en-US" w:eastAsia="en-US"/>
+              <w14:ligatures w14:val="standardContextual"/>
+            </w:rPr>
+          </w:pPr>
+          <w:hyperlink w:anchor="_Toc221794998" w:history="1">
+            <w:r>
+              <w:rPr>
+                <w:rStyle w:val="Hyperlink"/>
                 <w:rFonts w:ascii="Times New Roman" w:hAnsi="Times New Roman" w:cs="Times New Roman"/>
+                <w:b/>
+                <w:noProof/>
+              </w:rPr>
+              <w:t xml:space="preserve">Задание 1: </w:t>
+            </w:r>
+            <w:r>
+              <w:rPr>
+                <w:rStyle w:val="Hyperlink"/>
+                <w:rFonts w:ascii="Times New Roman" w:hAnsi="Times New Roman" w:cs="Times New Roman"/>
+                <w:b/>
+                <w:noProof/>
+                <w:lang w:val="en-US"/>
+              </w:rPr>
+              <w:t>arcsin(x)</w:t>
+            </w:r>
+            <w:r>
+              <w:rPr>
+                <w:noProof/>
+                <w:webHidden/>
+              </w:rPr>
+              <w:tab/>
+            </w:r>
+            <w:r>
+              <w:rPr>
+                <w:noProof/>
+                <w:webHidden/>
+              </w:rPr>
+              <w:fldChar w:fldCharType="begin"/>
+            </w:r>
+            <w:r>
+              <w:rPr>
+                <w:noProof/>
+                <w:webHidden/>
+              </w:rPr>
+              <w:instrText xml:space="preserve"> PAGEREF _Toc221794998 \h </w:instrText>
+            </w:r>
+            <w:r>
+              <w:rPr>
+                <w:noProof/>
+                <w:webHidden/>
+              </w:rPr>
+            </w:r>
+            <w:r>
+              <w:rPr>
+                <w:noProof/>
+                <w:webHidden/>
+              </w:rPr>
+              <w:fldChar w:fldCharType="separate"/>
+            </w:r>
+            <w:r>
+              <w:rPr>
+                <w:noProof/>
+                <w:webHidden/>
+              </w:rPr>
+              <w:t>5</w:t>
+            </w:r>
+            <w:r>
+              <w:rPr>
+                <w:noProof/>
+                <w:webHidden/>
+              </w:rPr>
+              <w:fldChar w:fldCharType="end"/>
+            </w:r>
+          </w:hyperlink>
+        </w:p>
+        <w:p>
+          <w:pPr>
+            <w:pStyle w:val="TOC2"/>
+            <w:tabs>
+              <w:tab w:val="right" w:leader="dot" w:pos="9019"/>
+            </w:tabs>
+            <w:rPr>
+              <w:rFonts w:asciiTheme="minorHAnsi" w:hAnsiTheme="minorHAnsi" w:cstheme="minorBidi"/>
+              <w:noProof/>
+              <w:kern w:val="2"/>
+              <w:sz w:val="24"/>
+              <w:szCs w:val="24"/>
+              <w:lang w:val="en-US" w:eastAsia="en-US"/>
+              <w14:ligatures w14:val="standardContextual"/>
+            </w:rPr>
+          </w:pPr>
+          <w:hyperlink w:anchor="_Toc221794999" w:history="1">
+            <w:r>
+              <w:rPr>
+                <w:rStyle w:val="Hyperlink"/>
+                <w:rFonts w:ascii="Times New Roman" w:hAnsi="Times New Roman" w:cs="Times New Roman"/>
+                <w:b/>
+                <w:noProof/>
+              </w:rPr>
+              <w:t xml:space="preserve">Задание 2: </w:t>
+            </w:r>
+            <w:r>
+              <w:rPr>
+                <w:rStyle w:val="Hyperlink"/>
+                <w:rFonts w:ascii="Times New Roman" w:hAnsi="Times New Roman" w:cs="Times New Roman"/>
+                <w:b/>
+                <w:noProof/>
+                <w:lang w:val="en-US"/>
+              </w:rPr>
+              <w:t>BucketSort</w:t>
+            </w:r>
+            <w:r>
+              <w:rPr>
+                <w:noProof/>
+                <w:webHidden/>
+              </w:rPr>
+              <w:tab/>
+            </w:r>
+            <w:r>
+              <w:rPr>
+                <w:noProof/>
+                <w:webHidden/>
+              </w:rPr>
+              <w:fldChar w:fldCharType="begin"/>
+            </w:r>
+            <w:r>
+              <w:rPr>
+                <w:noProof/>
+                <w:webHidden/>
+              </w:rPr>
+              <w:instrText xml:space="preserve"> PAGEREF _Toc221794999 \h </w:instrText>
+            </w:r>
+            <w:r>
+              <w:rPr>
+                <w:noProof/>
+                <w:webHidden/>
+              </w:rPr>
+            </w:r>
+            <w:r>
+              <w:rPr>
+                <w:noProof/>
+                <w:webHidden/>
+              </w:rPr>
+              <w:fldChar w:fldCharType="separate"/>
+            </w:r>
+            <w:r>
+              <w:rPr>
+                <w:noProof/>
+                <w:webHidden/>
+              </w:rPr>
+              <w:t>8</w:t>
+            </w:r>
+            <w:r>
+              <w:rPr>
+                <w:noProof/>
+                <w:webHidden/>
+              </w:rPr>
+              <w:fldChar w:fldCharType="end"/>
+            </w:r>
+          </w:hyperlink>
+        </w:p>
+        <w:p>
+          <w:pPr>
+            <w:pStyle w:val="TOC2"/>
+            <w:tabs>
+              <w:tab w:val="right" w:leader="dot" w:pos="9019"/>
+            </w:tabs>
+            <w:rPr>
+              <w:rFonts w:asciiTheme="minorHAnsi" w:hAnsiTheme="minorHAnsi" w:cstheme="minorBidi"/>
+              <w:noProof/>
+              <w:kern w:val="2"/>
+              <w:sz w:val="24"/>
+              <w:szCs w:val="24"/>
+              <w:lang w:val="en-US" w:eastAsia="en-US"/>
+              <w14:ligatures w14:val="standardContextual"/>
+            </w:rPr>
+          </w:pPr>
+          <w:hyperlink w:anchor="_Toc221795000" w:history="1">
+            <w:r>
+              <w:rPr>
+                <w:rStyle w:val="Hyperlink"/>
+                <w:rFonts w:ascii="Times New Roman" w:hAnsi="Times New Roman" w:cs="Times New Roman"/>
+                <w:b/>
+                <w:noProof/>
+              </w:rPr>
+              <w:t xml:space="preserve">Задание </w:t>
+            </w:r>
+            <w:r>
+              <w:rPr>
+                <w:rStyle w:val="Hyperlink"/>
+                <w:rFonts w:ascii="Times New Roman" w:hAnsi="Times New Roman" w:cs="Times New Roman"/>
+                <w:b/>
+                <w:noProof/>
+                <w:lang w:val="vi-VN"/>
+              </w:rPr>
+              <w:t>3</w:t>
+            </w:r>
+            <w:r>
+              <w:rPr>
+                <w:rStyle w:val="Hyperlink"/>
+                <w:rFonts w:ascii="Times New Roman" w:hAnsi="Times New Roman" w:cs="Times New Roman"/>
+                <w:b/>
+                <w:noProof/>
+                <w:lang w:val="en-US"/>
+              </w:rPr>
+              <w:t>:</w:t>
+            </w:r>
+            <w:r>
+              <w:rPr>
+                <w:rStyle w:val="Hyperlink"/>
+                <w:rFonts w:ascii="Times New Roman" w:hAnsi="Times New Roman" w:cs="Times New Roman"/>
+                <w:b/>
+                <w:noProof/>
+              </w:rPr>
+              <w:t xml:space="preserve"> Описание предметной области</w:t>
+            </w:r>
+            <w:r>
+              <w:rPr>
+                <w:noProof/>
+                <w:webHidden/>
+              </w:rPr>
+              <w:tab/>
+            </w:r>
+            <w:r>
+              <w:rPr>
+                <w:noProof/>
+                <w:webHidden/>
+              </w:rPr>
+              <w:fldChar w:fldCharType="begin"/>
+            </w:r>
+            <w:r>
+              <w:rPr>
+                <w:noProof/>
+                <w:webHidden/>
+              </w:rPr>
+              <w:instrText xml:space="preserve"> PAGEREF _Toc221795000 \h </w:instrText>
+            </w:r>
+            <w:r>
+              <w:rPr>
+                <w:noProof/>
+                <w:webHidden/>
+              </w:rPr>
+            </w:r>
+            <w:r>
+              <w:rPr>
+                <w:noProof/>
+                <w:webHidden/>
+              </w:rPr>
+              <w:fldChar w:fldCharType="separate"/>
+            </w:r>
+            <w:r>
+              <w:rPr>
+                <w:noProof/>
+                <w:webHidden/>
+              </w:rPr>
+              <w:t>10</w:t>
+            </w:r>
+            <w:r>
+              <w:rPr>
                 <w:noProof/>
                 <w:webHidden/>
               </w:rPr>
@@ -1233,97 +1594,20 @@
           <w:pPr>
             <w:pStyle w:val="TOC1"/>
             <w:tabs>
+              <w:tab w:val="left" w:pos="440"/>
               <w:tab w:val="right" w:leader="dot" w:pos="9019"/>
             </w:tabs>
-            <w:spacing w:line="360" w:lineRule="auto"/>
             <w:rPr>
-              <w:rFonts w:ascii="Times New Roman" w:hAnsi="Times New Roman" w:cs="Times New Roman"/>
+              <w:rFonts w:asciiTheme="minorHAnsi" w:hAnsiTheme="minorHAnsi" w:cstheme="minorBidi"/>
               <w:noProof/>
-              <w:lang w:val="en-US"/>
+              <w:kern w:val="2"/>
+              <w:sz w:val="24"/>
+              <w:szCs w:val="24"/>
+              <w:lang w:val="en-US" w:eastAsia="en-US"/>
+              <w14:ligatures w14:val="standardContextual"/>
             </w:rPr>
           </w:pPr>
-          <w:hyperlink w:anchor="_Toc152985144" w:history="1">
-            <w:r>
-              <w:rPr>
-                <w:rStyle w:val="Hyperlink"/>
-                <w:rFonts w:ascii="Times New Roman" w:hAnsi="Times New Roman" w:cs="Times New Roman"/>
-                <w:b/>
-                <w:noProof/>
-                <w:lang w:val="ru-RU"/>
-              </w:rPr>
-              <w:t>Отчёт:</w:t>
-            </w:r>
-            <w:r>
-              <w:rPr>
-                <w:rFonts w:ascii="Times New Roman" w:hAnsi="Times New Roman" w:cs="Times New Roman"/>
-                <w:noProof/>
-                <w:webHidden/>
-              </w:rPr>
-              <w:tab/>
-            </w:r>
-            <w:r>
-              <w:rPr>
-                <w:rFonts w:ascii="Times New Roman" w:hAnsi="Times New Roman" w:cs="Times New Roman"/>
-                <w:noProof/>
-                <w:webHidden/>
-              </w:rPr>
-              <w:fldChar w:fldCharType="begin"/>
-            </w:r>
-            <w:r>
-              <w:rPr>
-                <w:rFonts w:ascii="Times New Roman" w:hAnsi="Times New Roman" w:cs="Times New Roman"/>
-                <w:noProof/>
-                <w:webHidden/>
-              </w:rPr>
-              <w:instrText xml:space="preserve"> PAGEREF _Toc152985144 \h </w:instrText>
-            </w:r>
-            <w:r>
-              <w:rPr>
-                <w:rFonts w:ascii="Times New Roman" w:hAnsi="Times New Roman" w:cs="Times New Roman"/>
-                <w:noProof/>
-                <w:webHidden/>
-              </w:rPr>
-            </w:r>
-            <w:r>
-              <w:rPr>
-                <w:rFonts w:ascii="Times New Roman" w:hAnsi="Times New Roman" w:cs="Times New Roman"/>
-                <w:noProof/>
-                <w:webHidden/>
-              </w:rPr>
-              <w:fldChar w:fldCharType="separate"/>
-            </w:r>
-            <w:r>
-              <w:rPr>
-                <w:rFonts w:ascii="Times New Roman" w:hAnsi="Times New Roman" w:cs="Times New Roman"/>
-                <w:noProof/>
-                <w:webHidden/>
-              </w:rPr>
-              <w:t>5</w:t>
-            </w:r>
-            <w:r>
-              <w:rPr>
-                <w:rFonts w:ascii="Times New Roman" w:hAnsi="Times New Roman" w:cs="Times New Roman"/>
-                <w:noProof/>
-                <w:webHidden/>
-              </w:rPr>
-              <w:fldChar w:fldCharType="end"/>
-            </w:r>
-          </w:hyperlink>
-        </w:p>
-        <w:p>
-          <w:pPr>
-            <w:pStyle w:val="TOC1"/>
-            <w:tabs>
-              <w:tab w:val="right" w:leader="dot" w:pos="9019"/>
-            </w:tabs>
-            <w:spacing w:line="360" w:lineRule="auto"/>
-            <w:rPr>
-              <w:rFonts w:ascii="Times New Roman" w:hAnsi="Times New Roman" w:cs="Times New Roman"/>
-              <w:noProof/>
-              <w:lang w:val="en-US"/>
-            </w:rPr>
-          </w:pPr>
-          <w:hyperlink w:anchor="_Toc152985145" w:history="1">
+          <w:hyperlink w:anchor="_Toc221795001" w:history="1">
             <w:r>
               <w:rPr>
                 <w:rStyle w:val="Hyperlink"/>
@@ -1331,96 +1615,20 @@
                 <w:b/>
                 <w:noProof/>
               </w:rPr>
-              <w:t>Результат</w:t>
+              <w:t>3.</w:t>
             </w:r>
             <w:r>
               <w:rPr>
-                <w:rStyle w:val="Hyperlink"/>
-                <w:rFonts w:ascii="Times New Roman" w:hAnsi="Times New Roman" w:cs="Times New Roman"/>
+                <w:rFonts w:asciiTheme="minorHAnsi" w:hAnsiTheme="minorHAnsi" w:cstheme="minorBidi"/>
                 <w:noProof/>
-              </w:rPr>
-              <w:t xml:space="preserve"> </w:t>
-            </w:r>
-            <w:r>
-              <w:rPr>
-                <w:rStyle w:val="Hyperlink"/>
-                <w:rFonts w:ascii="Times New Roman" w:hAnsi="Times New Roman" w:cs="Times New Roman"/>
-                <w:b/>
-                <w:noProof/>
-              </w:rPr>
-              <w:t>работы:</w:t>
-            </w:r>
-            <w:r>
-              <w:rPr>
-                <w:rFonts w:ascii="Times New Roman" w:hAnsi="Times New Roman" w:cs="Times New Roman"/>
-                <w:noProof/>
-                <w:webHidden/>
+                <w:kern w:val="2"/>
+                <w:sz w:val="24"/>
+                <w:szCs w:val="24"/>
+                <w:lang w:val="en-US" w:eastAsia="en-US"/>
+                <w14:ligatures w14:val="standardContextual"/>
               </w:rPr>
               <w:tab/>
             </w:r>
-            <w:r>
-              <w:rPr>
-                <w:rFonts w:ascii="Times New Roman" w:hAnsi="Times New Roman" w:cs="Times New Roman"/>
-                <w:noProof/>
-                <w:webHidden/>
-              </w:rPr>
-              <w:fldChar w:fldCharType="begin"/>
-            </w:r>
-            <w:r>
-              <w:rPr>
-                <w:rFonts w:ascii="Times New Roman" w:hAnsi="Times New Roman" w:cs="Times New Roman"/>
-                <w:noProof/>
-                <w:webHidden/>
-              </w:rPr>
-              <w:instrText xml:space="preserve"> PAGEREF _Toc152985145 \h </w:instrText>
-            </w:r>
-            <w:r>
-              <w:rPr>
-                <w:rFonts w:ascii="Times New Roman" w:hAnsi="Times New Roman" w:cs="Times New Roman"/>
-                <w:noProof/>
-                <w:webHidden/>
-              </w:rPr>
-            </w:r>
-            <w:r>
-              <w:rPr>
-                <w:rFonts w:ascii="Times New Roman" w:hAnsi="Times New Roman" w:cs="Times New Roman"/>
-                <w:noProof/>
-                <w:webHidden/>
-              </w:rPr>
-              <w:fldChar w:fldCharType="separate"/>
-            </w:r>
-            <w:r>
-              <w:rPr>
-                <w:rFonts w:ascii="Times New Roman" w:hAnsi="Times New Roman" w:cs="Times New Roman"/>
-                <w:noProof/>
-                <w:webHidden/>
-              </w:rPr>
-              <w:t>5</w:t>
-            </w:r>
-            <w:r>
-              <w:rPr>
-                <w:rFonts w:ascii="Times New Roman" w:hAnsi="Times New Roman" w:cs="Times New Roman"/>
-                <w:noProof/>
-                <w:webHidden/>
-              </w:rPr>
-              <w:fldChar w:fldCharType="end"/>
-            </w:r>
-          </w:hyperlink>
-        </w:p>
-        <w:p>
-          <w:pPr>
-            <w:pStyle w:val="TOC1"/>
-            <w:tabs>
-              <w:tab w:val="right" w:leader="dot" w:pos="9019"/>
-            </w:tabs>
-            <w:spacing w:line="360" w:lineRule="auto"/>
-            <w:rPr>
-              <w:rFonts w:ascii="Times New Roman" w:hAnsi="Times New Roman" w:cs="Times New Roman"/>
-              <w:noProof/>
-              <w:lang w:val="en-US"/>
-            </w:rPr>
-          </w:pPr>
-          <w:hyperlink w:anchor="_Toc152985146" w:history="1">
             <w:r>
               <w:rPr>
                 <w:rStyle w:val="Hyperlink"/>
@@ -1432,7 +1640,6 @@
             </w:r>
             <w:r>
               <w:rPr>
-                <w:rFonts w:ascii="Times New Roman" w:hAnsi="Times New Roman" w:cs="Times New Roman"/>
                 <w:noProof/>
                 <w:webHidden/>
               </w:rPr>
@@ -1440,7 +1647,6 @@
             </w:r>
             <w:r>
               <w:rPr>
-                <w:rFonts w:ascii="Times New Roman" w:hAnsi="Times New Roman" w:cs="Times New Roman"/>
                 <w:noProof/>
                 <w:webHidden/>
               </w:rPr>
@@ -1448,22 +1654,19 @@
             </w:r>
             <w:r>
               <w:rPr>
-                <w:rFonts w:ascii="Times New Roman" w:hAnsi="Times New Roman" w:cs="Times New Roman"/>
                 <w:noProof/>
                 <w:webHidden/>
               </w:rPr>
-              <w:instrText xml:space="preserve"> PAGEREF _Toc152985146 \h </w:instrText>
+              <w:instrText xml:space="preserve"> PAGEREF _Toc221795001 \h </w:instrText>
             </w:r>
             <w:r>
               <w:rPr>
-                <w:rFonts w:ascii="Times New Roman" w:hAnsi="Times New Roman" w:cs="Times New Roman"/>
                 <w:noProof/>
                 <w:webHidden/>
               </w:rPr>
             </w:r>
             <w:r>
               <w:rPr>
-                <w:rFonts w:ascii="Times New Roman" w:hAnsi="Times New Roman" w:cs="Times New Roman"/>
                 <w:noProof/>
                 <w:webHidden/>
               </w:rPr>
@@ -1471,15 +1674,13 @@
             </w:r>
             <w:r>
               <w:rPr>
-                <w:rFonts w:ascii="Times New Roman" w:hAnsi="Times New Roman" w:cs="Times New Roman"/>
                 <w:noProof/>
                 <w:webHidden/>
               </w:rPr>
-              <w:t>5</w:t>
+              <w:t>12</w:t>
             </w:r>
             <w:r>
               <w:rPr>
-                <w:rFonts w:ascii="Times New Roman" w:hAnsi="Times New Roman" w:cs="Times New Roman"/>
                 <w:noProof/>
                 <w:webHidden/>
               </w:rPr>
@@ -1526,7 +1727,7 @@
         </w:rPr>
         <w:br w:type="page"/>
       </w:r>
-      <w:bookmarkStart w:id="0" w:name="_Toc152985142"/>
+      <w:bookmarkStart w:id="0" w:name="_Toc221794996"/>
       <w:r>
         <w:rPr>
           <w:rFonts w:ascii="Times New Roman" w:hAnsi="Times New Roman" w:cs="Times New Roman"/>
@@ -1535,6 +1736,15 @@
           <w:lang w:val="ru-RU"/>
         </w:rPr>
         <w:lastRenderedPageBreak/>
+        <w:t xml:space="preserve">1. </w:t>
+      </w:r>
+      <w:r>
+        <w:rPr>
+          <w:rFonts w:ascii="Times New Roman" w:hAnsi="Times New Roman" w:cs="Times New Roman"/>
+          <w:b/>
+          <w:sz w:val="24"/>
+          <w:lang w:val="ru-RU"/>
+        </w:rPr>
         <w:t>Описание задания</w:t>
       </w:r>
       <w:r>
@@ -1785,7 +1995,17 @@
           <w:lang w:val="ru-RU"/>
         </w:rPr>
       </w:pPr>
-      <w:bookmarkStart w:id="1" w:name="_Toc152985143"/>
+      <w:bookmarkStart w:id="1" w:name="_Toc221794997"/>
+      <w:r>
+        <w:rPr>
+          <w:rFonts w:ascii="Times New Roman" w:hAnsi="Times New Roman" w:cs="Times New Roman"/>
+          <w:b/>
+          <w:sz w:val="24"/>
+          <w:lang w:val="en-US"/>
+        </w:rPr>
+        <w:lastRenderedPageBreak/>
+        <w:t xml:space="preserve">2. </w:t>
+      </w:r>
       <w:r>
         <w:rPr>
           <w:rFonts w:ascii="Times New Roman" w:hAnsi="Times New Roman" w:cs="Times New Roman"/>
@@ -1793,7 +2013,6 @@
           <w:sz w:val="24"/>
           <w:lang w:val="ru-RU"/>
         </w:rPr>
-        <w:lastRenderedPageBreak/>
         <w:t>Выполнение</w:t>
       </w:r>
       <w:r>
@@ -1944,15 +2163,15 @@
       <w:pPr>
         <w:pStyle w:val="Footer"/>
         <w:spacing w:line="360" w:lineRule="auto"/>
-        <w:outlineLvl w:val="0"/>
-        <w:rPr>
-          <w:rFonts w:ascii="Times New Roman" w:hAnsi="Times New Roman" w:cs="Times New Roman"/>
-          <w:b/>
-          <w:sz w:val="24"/>
-          <w:szCs w:val="32"/>
-          <w:lang w:val="en-US"/>
-        </w:rPr>
-      </w:pPr>
+        <w:outlineLvl w:val="1"/>
+        <w:rPr>
+          <w:rFonts w:ascii="Times New Roman" w:hAnsi="Times New Roman" w:cs="Times New Roman"/>
+          <w:b/>
+          <w:sz w:val="24"/>
+          <w:szCs w:val="32"/>
+        </w:rPr>
+      </w:pPr>
+      <w:bookmarkStart w:id="2" w:name="_Toc221794998"/>
       <w:r>
         <w:rPr>
           <w:rFonts w:ascii="Times New Roman" w:hAnsi="Times New Roman" w:cs="Times New Roman"/>
@@ -1963,6 +2182,7 @@
         <w:lastRenderedPageBreak/>
         <w:t xml:space="preserve">Задание 1: </w:t>
       </w:r>
+      <w:proofErr w:type="spellStart"/>
       <w:r>
         <w:rPr>
           <w:rFonts w:ascii="Times New Roman" w:hAnsi="Times New Roman" w:cs="Times New Roman"/>
@@ -1971,115 +2191,70 @@
           <w:szCs w:val="32"/>
           <w:lang w:val="en-US"/>
         </w:rPr>
-        <w:t>arcsin(x)</w:t>
-      </w:r>
+        <w:t>arcsin</w:t>
+      </w:r>
+      <w:proofErr w:type="spellEnd"/>
+      <w:r>
+        <w:rPr>
+          <w:rFonts w:ascii="Times New Roman" w:hAnsi="Times New Roman" w:cs="Times New Roman"/>
+          <w:b/>
+          <w:sz w:val="24"/>
+          <w:szCs w:val="32"/>
+        </w:rPr>
+        <w:t>(</w:t>
+      </w:r>
+      <w:r>
+        <w:rPr>
+          <w:rFonts w:ascii="Times New Roman" w:hAnsi="Times New Roman" w:cs="Times New Roman"/>
+          <w:b/>
+          <w:sz w:val="24"/>
+          <w:szCs w:val="32"/>
+          <w:lang w:val="en-US"/>
+        </w:rPr>
+        <w:t>x</w:t>
+      </w:r>
+      <w:r>
+        <w:rPr>
+          <w:rFonts w:ascii="Times New Roman" w:hAnsi="Times New Roman" w:cs="Times New Roman"/>
+          <w:b/>
+          <w:sz w:val="24"/>
+          <w:szCs w:val="32"/>
+        </w:rPr>
+        <w:t>)</w:t>
+      </w:r>
+      <w:bookmarkEnd w:id="2"/>
     </w:p>
     <w:p>
       <w:pPr>
         <w:pStyle w:val="Footer"/>
         <w:spacing w:line="360" w:lineRule="auto"/>
-        <w:rPr>
-          <w:rFonts w:ascii="Times New Roman" w:hAnsi="Times New Roman" w:cs="Times New Roman"/>
-          <w:b/>
-          <w:sz w:val="24"/>
-          <w:szCs w:val="32"/>
-          <w:lang w:val="en-US"/>
-        </w:rPr>
-      </w:pPr>
-      <w:r>
-        <w:rPr>
-          <w:rFonts w:ascii="Times New Roman" w:hAnsi="Times New Roman" w:cs="Times New Roman"/>
-          <w:b/>
-          <w:noProof/>
-          <w:sz w:val="24"/>
-          <w:szCs w:val="32"/>
-          <w:lang w:val="en-US"/>
-        </w:rPr>
-        <w:drawing>
-          <wp:inline distT="0" distB="0" distL="0" distR="0" wp14:anchorId="12825467" wp14:editId="17A98E82">
-            <wp:extent cx="5733415" cy="2727960"/>
-            <wp:effectExtent l="0" t="0" r="635" b="0"/>
-            <wp:docPr id="66420370" name="Picture 1"/>
-            <wp:cNvGraphicFramePr>
-              <a:graphicFrameLocks xmlns:a="http://schemas.openxmlformats.org/drawingml/2006/main" noChangeAspect="1"/>
-            </wp:cNvGraphicFramePr>
-            <a:graphic xmlns:a="http://schemas.openxmlformats.org/drawingml/2006/main">
-              <a:graphicData uri="http://schemas.openxmlformats.org/drawingml/2006/picture">
-                <pic:pic xmlns:pic="http://schemas.openxmlformats.org/drawingml/2006/picture">
-                  <pic:nvPicPr>
-                    <pic:cNvPr id="66420370" name=""/>
-                    <pic:cNvPicPr/>
-                  </pic:nvPicPr>
-                  <pic:blipFill>
-                    <a:blip r:embed="rId8"/>
-                    <a:stretch>
-                      <a:fillRect/>
-                    </a:stretch>
-                  </pic:blipFill>
-                  <pic:spPr>
-                    <a:xfrm>
-                      <a:off x="0" y="0"/>
-                      <a:ext cx="5733415" cy="2727960"/>
-                    </a:xfrm>
-                    <a:prstGeom prst="rect">
-                      <a:avLst/>
-                    </a:prstGeom>
-                  </pic:spPr>
-                </pic:pic>
-              </a:graphicData>
-            </a:graphic>
-          </wp:inline>
-        </w:drawing>
-      </w:r>
-    </w:p>
-    <w:p>
-      <w:pPr>
-        <w:pStyle w:val="Footer"/>
-        <w:spacing w:line="360" w:lineRule="auto"/>
-        <w:jc w:val="center"/>
-        <w:rPr>
-          <w:rFonts w:ascii="Times New Roman" w:hAnsi="Times New Roman" w:cs="Times New Roman"/>
-          <w:b/>
-          <w:i/>
-          <w:iCs/>
-          <w:sz w:val="24"/>
-          <w:szCs w:val="32"/>
-        </w:rPr>
-      </w:pPr>
-      <w:r>
-        <w:rPr>
-          <w:rFonts w:ascii="Times New Roman" w:hAnsi="Times New Roman" w:cs="Times New Roman"/>
-          <w:b/>
-          <w:i/>
-          <w:iCs/>
-          <w:sz w:val="24"/>
-          <w:szCs w:val="32"/>
-        </w:rPr>
-        <w:t>Рисунок 1 - arcsin(x)</w:t>
-      </w:r>
-    </w:p>
-    <w:p>
-      <w:pPr>
-        <w:pStyle w:val="Footer"/>
-        <w:spacing w:line="360" w:lineRule="auto"/>
-        <w:jc w:val="both"/>
-        <w:rPr>
-          <w:rFonts w:ascii="Times New Roman" w:hAnsi="Times New Roman" w:cs="Times New Roman"/>
-          <w:b/>
-          <w:sz w:val="24"/>
-          <w:szCs w:val="32"/>
-          <w:lang w:val="vi-VN"/>
-        </w:rPr>
-      </w:pPr>
-      <w:r>
-        <w:rPr>
-          <w:rFonts w:ascii="Times New Roman" w:hAnsi="Times New Roman" w:cs="Times New Roman"/>
-          <w:b/>
-          <w:sz w:val="24"/>
-          <w:szCs w:val="32"/>
-          <w:lang w:val="vi-VN"/>
-        </w:rPr>
-        <w:t>Выберем “интересные” для тестирования точки и классы эквивалентности</w:t>
+        <w:jc w:val="both"/>
+        <w:rPr>
+          <w:rFonts w:ascii="Times New Roman" w:hAnsi="Times New Roman" w:cs="Times New Roman"/>
+          <w:b/>
+          <w:sz w:val="24"/>
+          <w:szCs w:val="32"/>
+          <w:lang w:val="vi-VN"/>
+        </w:rPr>
+      </w:pPr>
+      <w:r>
+        <w:rPr>
+          <w:rFonts w:ascii="Times New Roman" w:hAnsi="Times New Roman" w:cs="Times New Roman"/>
+          <w:b/>
+          <w:sz w:val="24"/>
+          <w:szCs w:val="32"/>
+        </w:rPr>
+        <w:t>И</w:t>
+      </w:r>
+      <w:r>
+        <w:rPr>
+          <w:rFonts w:ascii="Times New Roman" w:hAnsi="Times New Roman" w:cs="Times New Roman"/>
+          <w:b/>
+          <w:sz w:val="24"/>
+          <w:szCs w:val="32"/>
+          <w:lang w:val="vi-VN"/>
+        </w:rPr>
+        <w:t>нтересные для тестирования точки и классы эквивалентности</w:t>
       </w:r>
     </w:p>
     <w:p>
@@ -2165,6 +2340,7 @@
         </w:rPr>
         <w:t>.</w:t>
       </w:r>
+      <w:proofErr w:type="spellStart"/>
       <w:r>
         <w:rPr>
           <w:rFonts w:ascii="Times New Roman" w:hAnsi="Times New Roman" w:cs="Times New Roman"/>
@@ -2175,6 +2351,7 @@
         </w:rPr>
         <w:t>asin</w:t>
       </w:r>
+      <w:proofErr w:type="spellEnd"/>
       <w:r>
         <w:rPr>
           <w:rFonts w:ascii="Times New Roman" w:hAnsi="Times New Roman" w:cs="Times New Roman"/>
@@ -2511,6 +2688,7 @@
         </w:rPr>
         <w:t>.</w:t>
       </w:r>
+      <w:proofErr w:type="spellStart"/>
       <w:r>
         <w:rPr>
           <w:rFonts w:ascii="Times New Roman" w:hAnsi="Times New Roman" w:cs="Times New Roman"/>
@@ -2521,6 +2699,7 @@
         </w:rPr>
         <w:t>asin</w:t>
       </w:r>
+      <w:proofErr w:type="spellEnd"/>
       <w:r>
         <w:rPr>
           <w:rFonts w:ascii="Times New Roman" w:hAnsi="Times New Roman" w:cs="Times New Roman"/>
@@ -2791,6 +2970,7 @@
         </w:rPr>
         <w:t>.</w:t>
       </w:r>
+      <w:proofErr w:type="spellStart"/>
       <w:r>
         <w:rPr>
           <w:rFonts w:ascii="Times New Roman" w:hAnsi="Times New Roman" w:cs="Times New Roman"/>
@@ -2801,6 +2981,7 @@
         </w:rPr>
         <w:t>doubleToRawLongBits</w:t>
       </w:r>
+      <w:proofErr w:type="spellEnd"/>
       <w:r>
         <w:rPr>
           <w:rFonts w:ascii="Times New Roman" w:hAnsi="Times New Roman" w:cs="Times New Roman"/>
@@ -2900,7 +3081,6 @@
           <w:szCs w:val="32"/>
           <w:lang w:val="vi-VN"/>
         </w:rPr>
-        <w:lastRenderedPageBreak/>
         <w:t>x</w:t>
       </w:r>
       <w:r>
@@ -2969,6 +3149,7 @@
         </w:rPr>
         <w:t xml:space="preserve">результат равен </w:t>
       </w:r>
+      <w:proofErr w:type="spellStart"/>
       <w:r>
         <w:rPr>
           <w:rFonts w:ascii="Times New Roman" w:hAnsi="Times New Roman" w:cs="Times New Roman"/>
@@ -2979,6 +3160,7 @@
         </w:rPr>
         <w:t>NaN</w:t>
       </w:r>
+      <w:proofErr w:type="spellEnd"/>
     </w:p>
     <w:p>
       <w:pPr>
@@ -3059,6 +3241,7 @@
         </w:rPr>
         <w:t xml:space="preserve">возвращает </w:t>
       </w:r>
+      <w:proofErr w:type="spellStart"/>
       <w:r>
         <w:rPr>
           <w:rFonts w:ascii="Times New Roman" w:hAnsi="Times New Roman" w:cs="Times New Roman"/>
@@ -3069,6 +3252,7 @@
         </w:rPr>
         <w:t>NaN</w:t>
       </w:r>
+      <w:proofErr w:type="spellEnd"/>
     </w:p>
     <w:p>
       <w:pPr>
@@ -3095,8 +3279,9 @@
           <w:szCs w:val="32"/>
           <w:lang w:val="en-US"/>
         </w:rPr>
-        <w:t>x = Double.NaN, x = Double.POSITIVE_INFINITY, x = Double.NEGATIVE_</w:t>
-      </w:r>
+        <w:t xml:space="preserve">x = </w:t>
+      </w:r>
+      <w:proofErr w:type="spellStart"/>
       <w:r>
         <w:rPr>
           <w:rFonts w:ascii="Times New Roman" w:hAnsi="Times New Roman" w:cs="Times New Roman"/>
@@ -3105,8 +3290,63 @@
           <w:szCs w:val="32"/>
           <w:lang w:val="en-US"/>
         </w:rPr>
+        <w:t>Double.NaN</w:t>
+      </w:r>
+      <w:proofErr w:type="spellEnd"/>
+      <w:r>
+        <w:rPr>
+          <w:rFonts w:ascii="Times New Roman" w:hAnsi="Times New Roman" w:cs="Times New Roman"/>
+          <w:b/>
+          <w:sz w:val="24"/>
+          <w:szCs w:val="32"/>
+          <w:lang w:val="en-US"/>
+        </w:rPr>
+        <w:t xml:space="preserve">, x = </w:t>
+      </w:r>
+      <w:proofErr w:type="spellStart"/>
+      <w:r>
+        <w:rPr>
+          <w:rFonts w:ascii="Times New Roman" w:hAnsi="Times New Roman" w:cs="Times New Roman"/>
+          <w:b/>
+          <w:sz w:val="24"/>
+          <w:szCs w:val="32"/>
+          <w:lang w:val="en-US"/>
+        </w:rPr>
+        <w:t>Double.POSITIVE_INFINITY</w:t>
+      </w:r>
+      <w:proofErr w:type="spellEnd"/>
+      <w:r>
+        <w:rPr>
+          <w:rFonts w:ascii="Times New Roman" w:hAnsi="Times New Roman" w:cs="Times New Roman"/>
+          <w:b/>
+          <w:sz w:val="24"/>
+          <w:szCs w:val="32"/>
+          <w:lang w:val="en-US"/>
+        </w:rPr>
+        <w:t xml:space="preserve">, x = </w:t>
+      </w:r>
+      <w:proofErr w:type="spellStart"/>
+      <w:r>
+        <w:rPr>
+          <w:rFonts w:ascii="Times New Roman" w:hAnsi="Times New Roman" w:cs="Times New Roman"/>
+          <w:b/>
+          <w:sz w:val="24"/>
+          <w:szCs w:val="32"/>
+          <w:lang w:val="en-US"/>
+        </w:rPr>
+        <w:t>Double.NEGATIVE_</w:t>
+      </w:r>
+      <w:r>
+        <w:rPr>
+          <w:rFonts w:ascii="Times New Roman" w:hAnsi="Times New Roman" w:cs="Times New Roman"/>
+          <w:b/>
+          <w:sz w:val="24"/>
+          <w:szCs w:val="32"/>
+          <w:lang w:val="en-US"/>
+        </w:rPr>
         <w:t>INFINITY</w:t>
       </w:r>
+      <w:proofErr w:type="spellEnd"/>
       <w:r>
         <w:rPr>
           <w:rFonts w:ascii="Times New Roman" w:hAnsi="Times New Roman" w:cs="Times New Roman"/>
@@ -3353,6 +3593,7 @@
           <w:szCs w:val="32"/>
           <w:lang w:val="vi-VN"/>
         </w:rPr>
+        <w:lastRenderedPageBreak/>
         <w:t>Монотонность: если a &lt; b, то asin(a) &lt; asin(b)</w:t>
       </w:r>
     </w:p>
@@ -3451,1483 +3692,6 @@
         </w:rPr>
         <w:t>Для каждого x проверяем совпадение с Math.asin(x) в пределах допусков.</w:t>
       </w:r>
-    </w:p>
-    <w:p>
-      <w:pPr>
-        <w:pStyle w:val="Footer"/>
-        <w:spacing w:line="360" w:lineRule="auto"/>
-        <w:jc w:val="both"/>
-        <w:rPr>
-          <w:rFonts w:ascii="Times New Roman" w:hAnsi="Times New Roman" w:cs="Times New Roman"/>
-          <w:b/>
-          <w:sz w:val="24"/>
-          <w:szCs w:val="32"/>
-          <w:lang w:val="vi-VN"/>
-        </w:rPr>
-      </w:pPr>
-      <w:r>
-        <w:rPr>
-          <w:rFonts w:ascii="Times New Roman" w:hAnsi="Times New Roman" w:cs="Times New Roman"/>
-          <w:b/>
-          <w:sz w:val="24"/>
-          <w:szCs w:val="32"/>
-          <w:lang w:val="ru"/>
-        </w:rPr>
-        <w:t>Таблица тестовых данных для “интересных” точек</w:t>
-      </w:r>
-    </w:p>
-    <w:p>
-      <w:pPr>
-        <w:pStyle w:val="Footer"/>
-        <w:spacing w:line="360" w:lineRule="auto"/>
-        <w:ind w:left="360"/>
-        <w:jc w:val="both"/>
-        <w:rPr>
-          <w:rFonts w:ascii="Times New Roman" w:hAnsi="Times New Roman" w:cs="Times New Roman"/>
-          <w:bCs/>
-          <w:sz w:val="24"/>
-          <w:szCs w:val="32"/>
-          <w:lang w:val="vi-VN"/>
-        </w:rPr>
-      </w:pPr>
-    </w:p>
-    <w:tbl>
-      <w:tblPr>
-        <w:tblStyle w:val="TableGrid"/>
-        <w:tblW w:w="0" w:type="auto"/>
-        <w:jc w:val="center"/>
-        <w:tblLook w:val="04A0" w:firstRow="1" w:lastRow="0" w:firstColumn="1" w:lastColumn="0" w:noHBand="0" w:noVBand="1"/>
-      </w:tblPr>
-      <w:tblGrid>
-        <w:gridCol w:w="4509"/>
-        <w:gridCol w:w="4510"/>
-      </w:tblGrid>
-      <w:tr>
-        <w:trPr>
-          <w:jc w:val="center"/>
-        </w:trPr>
-        <w:tc>
-          <w:tcPr>
-            <w:tcW w:w="4509" w:type="dxa"/>
-          </w:tcPr>
-          <w:p>
-            <w:pPr>
-              <w:pStyle w:val="Footer"/>
-              <w:spacing w:line="360" w:lineRule="auto"/>
-              <w:jc w:val="center"/>
-              <w:rPr>
-                <w:rFonts w:ascii="Times New Roman" w:hAnsi="Times New Roman" w:cs="Times New Roman"/>
-                <w:bCs/>
-                <w:sz w:val="24"/>
-                <w:szCs w:val="32"/>
-                <w:lang w:val="vi-VN"/>
-              </w:rPr>
-            </w:pPr>
-            <w:r>
-              <w:rPr>
-                <w:rFonts w:ascii="Times New Roman" w:hAnsi="Times New Roman" w:cs="Times New Roman"/>
-                <w:bCs/>
-                <w:sz w:val="24"/>
-                <w:szCs w:val="32"/>
-                <w:lang w:val="vi-VN"/>
-              </w:rPr>
-              <w:t>x</w:t>
-            </w:r>
-          </w:p>
-        </w:tc>
-        <w:tc>
-          <w:tcPr>
-            <w:tcW w:w="4510" w:type="dxa"/>
-          </w:tcPr>
-          <w:p>
-            <w:pPr>
-              <w:pStyle w:val="Footer"/>
-              <w:spacing w:line="360" w:lineRule="auto"/>
-              <w:jc w:val="center"/>
-              <w:rPr>
-                <w:rFonts w:ascii="Times New Roman" w:hAnsi="Times New Roman" w:cs="Times New Roman"/>
-                <w:bCs/>
-                <w:sz w:val="24"/>
-                <w:szCs w:val="32"/>
-                <w:lang w:val="vi-VN"/>
-              </w:rPr>
-            </w:pPr>
-            <w:r>
-              <w:rPr>
-                <w:rFonts w:ascii="Times New Roman" w:hAnsi="Times New Roman" w:cs="Times New Roman"/>
-                <w:bCs/>
-                <w:sz w:val="24"/>
-                <w:szCs w:val="32"/>
-                <w:lang w:val="vi-VN"/>
-              </w:rPr>
-              <w:t>arcsin(x)</w:t>
-            </w:r>
-          </w:p>
-        </w:tc>
-      </w:tr>
-      <w:tr>
-        <w:trPr>
-          <w:jc w:val="center"/>
-        </w:trPr>
-        <w:tc>
-          <w:tcPr>
-            <w:tcW w:w="4509" w:type="dxa"/>
-          </w:tcPr>
-          <w:p>
-            <w:pPr>
-              <w:pStyle w:val="Footer"/>
-              <w:spacing w:line="360" w:lineRule="auto"/>
-              <w:jc w:val="center"/>
-              <w:rPr>
-                <w:rFonts w:ascii="Times New Roman" w:hAnsi="Times New Roman" w:cs="Times New Roman"/>
-                <w:bCs/>
-                <w:sz w:val="24"/>
-                <w:szCs w:val="32"/>
-                <w:lang w:val="vi-VN"/>
-              </w:rPr>
-            </w:pPr>
-            <w:r>
-              <w:rPr>
-                <w:rFonts w:ascii="Times New Roman" w:hAnsi="Times New Roman" w:cs="Times New Roman"/>
-                <w:bCs/>
-                <w:sz w:val="24"/>
-                <w:szCs w:val="32"/>
-                <w:lang w:val="vi-VN"/>
-              </w:rPr>
-              <w:t>-1.0</w:t>
-            </w:r>
-          </w:p>
-        </w:tc>
-        <w:tc>
-          <w:tcPr>
-            <w:tcW w:w="4510" w:type="dxa"/>
-          </w:tcPr>
-          <w:p>
-            <w:pPr>
-              <w:pStyle w:val="Footer"/>
-              <w:spacing w:line="360" w:lineRule="auto"/>
-              <w:jc w:val="center"/>
-              <w:rPr>
-                <w:rFonts w:ascii="Times New Roman" w:hAnsi="Times New Roman" w:cs="Times New Roman"/>
-                <w:bCs/>
-                <w:sz w:val="24"/>
-                <w:szCs w:val="32"/>
-                <w:lang w:val="vi-VN"/>
-              </w:rPr>
-            </w:pPr>
-            <m:oMathPara>
-              <m:oMath>
-                <m:f>
-                  <m:fPr>
-                    <m:ctrlPr>
-                      <w:rPr>
-                        <w:rFonts w:ascii="Cambria Math" w:hAnsi="Cambria Math" w:cs="Times New Roman"/>
-                        <w:bCs/>
-                        <w:i/>
-                        <w:sz w:val="24"/>
-                        <w:szCs w:val="32"/>
-                        <w:lang w:val="en-US"/>
-                      </w:rPr>
-                    </m:ctrlPr>
-                  </m:fPr>
-                  <m:num>
-                    <m:r>
-                      <w:rPr>
-                        <w:rFonts w:ascii="Cambria Math" w:hAnsi="Cambria Math" w:cs="Times New Roman"/>
-                        <w:sz w:val="24"/>
-                        <w:szCs w:val="32"/>
-                        <w:lang w:val="en-US"/>
-                      </w:rPr>
-                      <m:t>- π</m:t>
-                    </m:r>
-                  </m:num>
-                  <m:den>
-                    <m:r>
-                      <w:rPr>
-                        <w:rFonts w:ascii="Cambria Math" w:hAnsi="Cambria Math" w:cs="Times New Roman"/>
-                        <w:sz w:val="24"/>
-                        <w:szCs w:val="32"/>
-                        <w:lang w:val="en-US"/>
-                      </w:rPr>
-                      <m:t>2</m:t>
-                    </m:r>
-                  </m:den>
-                </m:f>
-              </m:oMath>
-            </m:oMathPara>
-          </w:p>
-        </w:tc>
-      </w:tr>
-      <w:tr>
-        <w:trPr>
-          <w:jc w:val="center"/>
-        </w:trPr>
-        <w:tc>
-          <w:tcPr>
-            <w:tcW w:w="4509" w:type="dxa"/>
-          </w:tcPr>
-          <w:p>
-            <w:pPr>
-              <w:pStyle w:val="Footer"/>
-              <w:spacing w:line="360" w:lineRule="auto"/>
-              <w:jc w:val="center"/>
-              <w:rPr>
-                <w:rFonts w:ascii="Times New Roman" w:hAnsi="Times New Roman" w:cs="Times New Roman"/>
-                <w:bCs/>
-                <w:sz w:val="24"/>
-                <w:szCs w:val="32"/>
-                <w:lang w:val="en-US"/>
-              </w:rPr>
-            </w:pPr>
-            <w:r>
-              <w:rPr>
-                <w:rFonts w:ascii="Times New Roman" w:hAnsi="Times New Roman" w:cs="Times New Roman"/>
-                <w:bCs/>
-                <w:sz w:val="24"/>
-                <w:szCs w:val="32"/>
-                <w:lang w:val="en-US"/>
-              </w:rPr>
-              <w:t>-0.99</w:t>
-            </w:r>
-          </w:p>
-        </w:tc>
-        <w:tc>
-          <w:tcPr>
-            <w:tcW w:w="4510" w:type="dxa"/>
-          </w:tcPr>
-          <w:p>
-            <w:pPr>
-              <w:pStyle w:val="Footer"/>
-              <w:spacing w:line="360" w:lineRule="auto"/>
-              <w:jc w:val="center"/>
-              <w:rPr>
-                <w:rFonts w:ascii="Times New Roman" w:hAnsi="Times New Roman" w:cs="Times New Roman"/>
-                <w:bCs/>
-                <w:sz w:val="24"/>
-                <w:szCs w:val="32"/>
-                <w:lang w:val="en-US"/>
-              </w:rPr>
-            </w:pPr>
-            <w:r>
-              <w:rPr>
-                <w:rFonts w:ascii="Times New Roman" w:hAnsi="Times New Roman" w:cs="Times New Roman"/>
-                <w:bCs/>
-                <w:sz w:val="24"/>
-                <w:szCs w:val="32"/>
-                <w:lang w:val="en-US"/>
-              </w:rPr>
-              <w:t>-1.4293</w:t>
-            </w:r>
-          </w:p>
-        </w:tc>
-      </w:tr>
-      <w:tr>
-        <w:trPr>
-          <w:jc w:val="center"/>
-        </w:trPr>
-        <w:tc>
-          <w:tcPr>
-            <w:tcW w:w="4509" w:type="dxa"/>
-          </w:tcPr>
-          <w:p>
-            <w:pPr>
-              <w:pStyle w:val="Footer"/>
-              <w:spacing w:line="360" w:lineRule="auto"/>
-              <w:jc w:val="center"/>
-              <w:rPr>
-                <w:rFonts w:ascii="Times New Roman" w:hAnsi="Times New Roman" w:cs="Times New Roman"/>
-                <w:bCs/>
-                <w:sz w:val="24"/>
-                <w:szCs w:val="32"/>
-                <w:lang w:val="en-US"/>
-              </w:rPr>
-            </w:pPr>
-            <w:r>
-              <w:rPr>
-                <w:rFonts w:ascii="Times New Roman" w:hAnsi="Times New Roman" w:cs="Times New Roman"/>
-                <w:bCs/>
-                <w:sz w:val="24"/>
-                <w:szCs w:val="32"/>
-                <w:lang w:val="en-US"/>
-              </w:rPr>
-              <w:t>-0.5</w:t>
-            </w:r>
-          </w:p>
-        </w:tc>
-        <w:tc>
-          <w:tcPr>
-            <w:tcW w:w="4510" w:type="dxa"/>
-          </w:tcPr>
-          <w:p>
-            <w:pPr>
-              <w:pStyle w:val="Footer"/>
-              <w:spacing w:line="360" w:lineRule="auto"/>
-              <w:jc w:val="center"/>
-              <w:rPr>
-                <w:rFonts w:ascii="Times New Roman" w:hAnsi="Times New Roman" w:cs="Times New Roman"/>
-                <w:bCs/>
-                <w:sz w:val="24"/>
-                <w:szCs w:val="32"/>
-                <w:lang w:val="en-US"/>
-              </w:rPr>
-            </w:pPr>
-            <w:r>
-              <w:rPr>
-                <w:rFonts w:ascii="Times New Roman" w:hAnsi="Times New Roman" w:cs="Times New Roman"/>
-                <w:bCs/>
-                <w:sz w:val="24"/>
-                <w:szCs w:val="32"/>
-                <w:lang w:val="en-US"/>
-              </w:rPr>
-              <w:t>-0.5236</w:t>
-            </w:r>
-          </w:p>
-        </w:tc>
-      </w:tr>
-      <w:tr>
-        <w:trPr>
-          <w:jc w:val="center"/>
-        </w:trPr>
-        <w:tc>
-          <w:tcPr>
-            <w:tcW w:w="4509" w:type="dxa"/>
-          </w:tcPr>
-          <w:p>
-            <w:pPr>
-              <w:pStyle w:val="Footer"/>
-              <w:spacing w:line="360" w:lineRule="auto"/>
-              <w:jc w:val="center"/>
-              <w:rPr>
-                <w:rFonts w:ascii="Times New Roman" w:hAnsi="Times New Roman" w:cs="Times New Roman"/>
-                <w:bCs/>
-                <w:sz w:val="24"/>
-                <w:szCs w:val="32"/>
-                <w:lang w:val="en-US"/>
-              </w:rPr>
-            </w:pPr>
-            <w:r>
-              <w:rPr>
-                <w:rFonts w:ascii="Times New Roman" w:hAnsi="Times New Roman" w:cs="Times New Roman"/>
-                <w:bCs/>
-                <w:sz w:val="24"/>
-                <w:szCs w:val="32"/>
-                <w:lang w:val="en-US"/>
-              </w:rPr>
-              <w:t>-0.000001</w:t>
-            </w:r>
-          </w:p>
-        </w:tc>
-        <w:tc>
-          <w:tcPr>
-            <w:tcW w:w="4510" w:type="dxa"/>
-          </w:tcPr>
-          <w:p>
-            <w:pPr>
-              <w:pStyle w:val="Footer"/>
-              <w:spacing w:line="360" w:lineRule="auto"/>
-              <w:jc w:val="center"/>
-              <w:rPr>
-                <w:rFonts w:ascii="Times New Roman" w:hAnsi="Times New Roman" w:cs="Times New Roman"/>
-                <w:bCs/>
-                <w:sz w:val="24"/>
-                <w:szCs w:val="32"/>
-                <w:lang w:val="en-US"/>
-              </w:rPr>
-            </w:pPr>
-            <w:r>
-              <w:rPr>
-                <w:rFonts w:ascii="Times New Roman" w:hAnsi="Times New Roman" w:cs="Times New Roman"/>
-                <w:bCs/>
-                <w:sz w:val="24"/>
-                <w:szCs w:val="32"/>
-                <w:lang w:val="en-US"/>
-              </w:rPr>
-              <w:t>-0.000001</w:t>
-            </w:r>
-          </w:p>
-        </w:tc>
-      </w:tr>
-      <w:tr>
-        <w:trPr>
-          <w:jc w:val="center"/>
-        </w:trPr>
-        <w:tc>
-          <w:tcPr>
-            <w:tcW w:w="4509" w:type="dxa"/>
-          </w:tcPr>
-          <w:p>
-            <w:pPr>
-              <w:pStyle w:val="Footer"/>
-              <w:spacing w:line="360" w:lineRule="auto"/>
-              <w:jc w:val="center"/>
-              <w:rPr>
-                <w:rFonts w:ascii="Times New Roman" w:hAnsi="Times New Roman" w:cs="Times New Roman"/>
-                <w:bCs/>
-                <w:sz w:val="24"/>
-                <w:szCs w:val="32"/>
-                <w:lang w:val="en-US"/>
-              </w:rPr>
-            </w:pPr>
-            <w:r>
-              <w:rPr>
-                <w:rFonts w:ascii="Times New Roman" w:hAnsi="Times New Roman" w:cs="Times New Roman"/>
-                <w:bCs/>
-                <w:sz w:val="24"/>
-                <w:szCs w:val="32"/>
-                <w:lang w:val="en-US"/>
-              </w:rPr>
-              <w:t>-0.0</w:t>
-            </w:r>
-          </w:p>
-        </w:tc>
-        <w:tc>
-          <w:tcPr>
-            <w:tcW w:w="4510" w:type="dxa"/>
-          </w:tcPr>
-          <w:p>
-            <w:pPr>
-              <w:pStyle w:val="Footer"/>
-              <w:spacing w:line="360" w:lineRule="auto"/>
-              <w:jc w:val="center"/>
-              <w:rPr>
-                <w:rFonts w:ascii="Times New Roman" w:hAnsi="Times New Roman" w:cs="Times New Roman"/>
-                <w:bCs/>
-                <w:sz w:val="24"/>
-                <w:szCs w:val="32"/>
-                <w:lang w:val="vi-VN"/>
-              </w:rPr>
-            </w:pPr>
-            <w:r>
-              <w:rPr>
-                <w:rFonts w:ascii="Times New Roman" w:hAnsi="Times New Roman" w:cs="Times New Roman"/>
-                <w:bCs/>
-                <w:sz w:val="24"/>
-                <w:szCs w:val="32"/>
-                <w:lang w:val="en-US"/>
-              </w:rPr>
-              <w:t>-0.0</w:t>
-            </w:r>
-            <w:r>
-              <w:rPr>
-                <w:rFonts w:ascii="Times New Roman" w:hAnsi="Times New Roman" w:cs="Times New Roman"/>
-                <w:bCs/>
-                <w:sz w:val="24"/>
-                <w:szCs w:val="32"/>
-                <w:lang w:val="vi-VN"/>
-              </w:rPr>
-              <w:t xml:space="preserve"> </w:t>
-            </w:r>
-            <w:r>
-              <w:rPr>
-                <w:rFonts w:ascii="Times New Roman" w:hAnsi="Times New Roman" w:cs="Times New Roman"/>
-                <w:bCs/>
-                <w:sz w:val="24"/>
-                <w:szCs w:val="32"/>
-                <w:lang w:val="en-US"/>
-              </w:rPr>
-              <w:t>(</w:t>
-            </w:r>
-            <w:r>
-              <w:rPr>
-                <w:rFonts w:ascii="Times New Roman" w:hAnsi="Times New Roman" w:cs="Times New Roman"/>
-                <w:bCs/>
-                <w:sz w:val="24"/>
-                <w:szCs w:val="32"/>
-                <w:lang w:val="ru"/>
-              </w:rPr>
-              <w:t>знак сохраняется</w:t>
-            </w:r>
-            <w:r>
-              <w:rPr>
-                <w:rFonts w:ascii="Times New Roman" w:hAnsi="Times New Roman" w:cs="Times New Roman"/>
-                <w:bCs/>
-                <w:sz w:val="24"/>
-                <w:szCs w:val="32"/>
-                <w:lang w:val="vi-VN"/>
-              </w:rPr>
-              <w:t>)</w:t>
-            </w:r>
-          </w:p>
-        </w:tc>
-      </w:tr>
-      <w:tr>
-        <w:trPr>
-          <w:jc w:val="center"/>
-        </w:trPr>
-        <w:tc>
-          <w:tcPr>
-            <w:tcW w:w="4509" w:type="dxa"/>
-          </w:tcPr>
-          <w:p>
-            <w:pPr>
-              <w:pStyle w:val="Footer"/>
-              <w:spacing w:line="360" w:lineRule="auto"/>
-              <w:jc w:val="center"/>
-              <w:rPr>
-                <w:rFonts w:ascii="Times New Roman" w:hAnsi="Times New Roman" w:cs="Times New Roman"/>
-                <w:bCs/>
-                <w:sz w:val="24"/>
-                <w:szCs w:val="32"/>
-                <w:lang w:val="vi-VN"/>
-              </w:rPr>
-            </w:pPr>
-            <w:r>
-              <w:rPr>
-                <w:rFonts w:ascii="Times New Roman" w:hAnsi="Times New Roman" w:cs="Times New Roman"/>
-                <w:bCs/>
-                <w:sz w:val="24"/>
-                <w:szCs w:val="32"/>
-                <w:lang w:val="en-US"/>
-              </w:rPr>
-              <w:t>0</w:t>
-            </w:r>
-            <w:r>
-              <w:rPr>
-                <w:rFonts w:ascii="Times New Roman" w:hAnsi="Times New Roman" w:cs="Times New Roman"/>
-                <w:bCs/>
-                <w:sz w:val="24"/>
-                <w:szCs w:val="32"/>
-                <w:lang w:val="vi-VN"/>
-              </w:rPr>
-              <w:t>.0</w:t>
-            </w:r>
-          </w:p>
-        </w:tc>
-        <w:tc>
-          <w:tcPr>
-            <w:tcW w:w="4510" w:type="dxa"/>
-          </w:tcPr>
-          <w:p>
-            <w:pPr>
-              <w:pStyle w:val="Footer"/>
-              <w:spacing w:line="360" w:lineRule="auto"/>
-              <w:jc w:val="center"/>
-              <w:rPr>
-                <w:rFonts w:ascii="Times New Roman" w:hAnsi="Times New Roman" w:cs="Times New Roman"/>
-                <w:bCs/>
-                <w:sz w:val="24"/>
-                <w:szCs w:val="32"/>
-                <w:lang w:val="vi-VN"/>
-              </w:rPr>
-            </w:pPr>
-            <w:r>
-              <w:rPr>
-                <w:rFonts w:ascii="Times New Roman" w:hAnsi="Times New Roman" w:cs="Times New Roman"/>
-                <w:bCs/>
-                <w:sz w:val="24"/>
-                <w:szCs w:val="32"/>
-                <w:lang w:val="en-US"/>
-              </w:rPr>
-              <w:t>0</w:t>
-            </w:r>
-            <w:r>
-              <w:rPr>
-                <w:rFonts w:ascii="Times New Roman" w:hAnsi="Times New Roman" w:cs="Times New Roman"/>
-                <w:bCs/>
-                <w:sz w:val="24"/>
-                <w:szCs w:val="32"/>
-                <w:lang w:val="vi-VN"/>
-              </w:rPr>
-              <w:t>.0</w:t>
-            </w:r>
-          </w:p>
-        </w:tc>
-      </w:tr>
-      <w:tr>
-        <w:trPr>
-          <w:jc w:val="center"/>
-        </w:trPr>
-        <w:tc>
-          <w:tcPr>
-            <w:tcW w:w="4509" w:type="dxa"/>
-          </w:tcPr>
-          <w:p>
-            <w:pPr>
-              <w:pStyle w:val="Footer"/>
-              <w:spacing w:line="360" w:lineRule="auto"/>
-              <w:jc w:val="center"/>
-              <w:rPr>
-                <w:rFonts w:ascii="Times New Roman" w:hAnsi="Times New Roman" w:cs="Times New Roman"/>
-                <w:bCs/>
-                <w:sz w:val="24"/>
-                <w:szCs w:val="32"/>
-                <w:lang w:val="vi-VN"/>
-              </w:rPr>
-            </w:pPr>
-            <w:r>
-              <w:rPr>
-                <w:rFonts w:ascii="Times New Roman" w:hAnsi="Times New Roman" w:cs="Times New Roman"/>
-                <w:bCs/>
-                <w:sz w:val="24"/>
-                <w:szCs w:val="32"/>
-                <w:lang w:val="en-US"/>
-              </w:rPr>
-              <w:t>0</w:t>
-            </w:r>
-            <w:r>
-              <w:rPr>
-                <w:rFonts w:ascii="Times New Roman" w:hAnsi="Times New Roman" w:cs="Times New Roman"/>
-                <w:bCs/>
-                <w:sz w:val="24"/>
-                <w:szCs w:val="32"/>
-                <w:lang w:val="vi-VN"/>
-              </w:rPr>
-              <w:t>.000001</w:t>
-            </w:r>
-          </w:p>
-        </w:tc>
-        <w:tc>
-          <w:tcPr>
-            <w:tcW w:w="4510" w:type="dxa"/>
-          </w:tcPr>
-          <w:p>
-            <w:pPr>
-              <w:pStyle w:val="Footer"/>
-              <w:spacing w:line="360" w:lineRule="auto"/>
-              <w:jc w:val="center"/>
-              <w:rPr>
-                <w:rFonts w:ascii="Times New Roman" w:hAnsi="Times New Roman" w:cs="Times New Roman"/>
-                <w:bCs/>
-                <w:sz w:val="24"/>
-                <w:szCs w:val="32"/>
-                <w:lang w:val="vi-VN"/>
-              </w:rPr>
-            </w:pPr>
-            <w:r>
-              <w:rPr>
-                <w:rFonts w:ascii="Times New Roman" w:hAnsi="Times New Roman" w:cs="Times New Roman"/>
-                <w:bCs/>
-                <w:sz w:val="24"/>
-                <w:szCs w:val="32"/>
-                <w:lang w:val="en-US"/>
-              </w:rPr>
-              <w:t>0</w:t>
-            </w:r>
-            <w:r>
-              <w:rPr>
-                <w:rFonts w:ascii="Times New Roman" w:hAnsi="Times New Roman" w:cs="Times New Roman"/>
-                <w:bCs/>
-                <w:sz w:val="24"/>
-                <w:szCs w:val="32"/>
-                <w:lang w:val="vi-VN"/>
-              </w:rPr>
-              <w:t>.000001</w:t>
-            </w:r>
-          </w:p>
-        </w:tc>
-      </w:tr>
-      <w:tr>
-        <w:trPr>
-          <w:jc w:val="center"/>
-        </w:trPr>
-        <w:tc>
-          <w:tcPr>
-            <w:tcW w:w="4509" w:type="dxa"/>
-          </w:tcPr>
-          <w:p>
-            <w:pPr>
-              <w:pStyle w:val="Footer"/>
-              <w:spacing w:line="360" w:lineRule="auto"/>
-              <w:jc w:val="center"/>
-              <w:rPr>
-                <w:rFonts w:ascii="Times New Roman" w:hAnsi="Times New Roman" w:cs="Times New Roman"/>
-                <w:bCs/>
-                <w:sz w:val="24"/>
-                <w:szCs w:val="32"/>
-                <w:lang w:val="vi-VN"/>
-              </w:rPr>
-            </w:pPr>
-            <w:r>
-              <w:rPr>
-                <w:rFonts w:ascii="Times New Roman" w:hAnsi="Times New Roman" w:cs="Times New Roman"/>
-                <w:bCs/>
-                <w:sz w:val="24"/>
-                <w:szCs w:val="32"/>
-                <w:lang w:val="en-US"/>
-              </w:rPr>
-              <w:t>0</w:t>
-            </w:r>
-            <w:r>
-              <w:rPr>
-                <w:rFonts w:ascii="Times New Roman" w:hAnsi="Times New Roman" w:cs="Times New Roman"/>
-                <w:bCs/>
-                <w:sz w:val="24"/>
-                <w:szCs w:val="32"/>
-                <w:lang w:val="vi-VN"/>
-              </w:rPr>
-              <w:t>.5</w:t>
-            </w:r>
-          </w:p>
-        </w:tc>
-        <w:tc>
-          <w:tcPr>
-            <w:tcW w:w="4510" w:type="dxa"/>
-          </w:tcPr>
-          <w:p>
-            <w:pPr>
-              <w:pStyle w:val="Footer"/>
-              <w:spacing w:line="360" w:lineRule="auto"/>
-              <w:jc w:val="center"/>
-              <w:rPr>
-                <w:rFonts w:ascii="Times New Roman" w:hAnsi="Times New Roman" w:cs="Times New Roman"/>
-                <w:bCs/>
-                <w:sz w:val="24"/>
-                <w:szCs w:val="32"/>
-                <w:lang w:val="vi-VN"/>
-              </w:rPr>
-            </w:pPr>
-            <w:r>
-              <w:rPr>
-                <w:rFonts w:ascii="Times New Roman" w:hAnsi="Times New Roman" w:cs="Times New Roman"/>
-                <w:bCs/>
-                <w:sz w:val="24"/>
-                <w:szCs w:val="32"/>
-                <w:lang w:val="en-US"/>
-              </w:rPr>
-              <w:t>0</w:t>
-            </w:r>
-            <w:r>
-              <w:rPr>
-                <w:rFonts w:ascii="Times New Roman" w:hAnsi="Times New Roman" w:cs="Times New Roman"/>
-                <w:bCs/>
-                <w:sz w:val="24"/>
-                <w:szCs w:val="32"/>
-                <w:lang w:val="vi-VN"/>
-              </w:rPr>
-              <w:t>.5236</w:t>
-            </w:r>
-          </w:p>
-        </w:tc>
-      </w:tr>
-      <w:tr>
-        <w:trPr>
-          <w:jc w:val="center"/>
-        </w:trPr>
-        <w:tc>
-          <w:tcPr>
-            <w:tcW w:w="4509" w:type="dxa"/>
-          </w:tcPr>
-          <w:p>
-            <w:pPr>
-              <w:pStyle w:val="Footer"/>
-              <w:spacing w:line="360" w:lineRule="auto"/>
-              <w:jc w:val="center"/>
-              <w:rPr>
-                <w:rFonts w:ascii="Times New Roman" w:hAnsi="Times New Roman" w:cs="Times New Roman"/>
-                <w:bCs/>
-                <w:sz w:val="24"/>
-                <w:szCs w:val="32"/>
-                <w:lang w:val="vi-VN"/>
-              </w:rPr>
-            </w:pPr>
-            <w:r>
-              <w:rPr>
-                <w:rFonts w:ascii="Times New Roman" w:hAnsi="Times New Roman" w:cs="Times New Roman"/>
-                <w:bCs/>
-                <w:sz w:val="24"/>
-                <w:szCs w:val="32"/>
-                <w:lang w:val="en-US"/>
-              </w:rPr>
-              <w:t>0</w:t>
-            </w:r>
-            <w:r>
-              <w:rPr>
-                <w:rFonts w:ascii="Times New Roman" w:hAnsi="Times New Roman" w:cs="Times New Roman"/>
-                <w:bCs/>
-                <w:sz w:val="24"/>
-                <w:szCs w:val="32"/>
-                <w:lang w:val="vi-VN"/>
-              </w:rPr>
-              <w:t>.99</w:t>
-            </w:r>
-          </w:p>
-        </w:tc>
-        <w:tc>
-          <w:tcPr>
-            <w:tcW w:w="4510" w:type="dxa"/>
-          </w:tcPr>
-          <w:p>
-            <w:pPr>
-              <w:pStyle w:val="Footer"/>
-              <w:spacing w:line="360" w:lineRule="auto"/>
-              <w:jc w:val="center"/>
-              <w:rPr>
-                <w:rFonts w:ascii="Times New Roman" w:hAnsi="Times New Roman" w:cs="Times New Roman"/>
-                <w:bCs/>
-                <w:sz w:val="24"/>
-                <w:szCs w:val="32"/>
-                <w:lang w:val="vi-VN"/>
-              </w:rPr>
-            </w:pPr>
-            <w:r>
-              <w:rPr>
-                <w:rFonts w:ascii="Times New Roman" w:hAnsi="Times New Roman" w:cs="Times New Roman"/>
-                <w:bCs/>
-                <w:sz w:val="24"/>
-                <w:szCs w:val="32"/>
-                <w:lang w:val="en-US"/>
-              </w:rPr>
-              <w:t>1</w:t>
-            </w:r>
-            <w:r>
-              <w:rPr>
-                <w:rFonts w:ascii="Times New Roman" w:hAnsi="Times New Roman" w:cs="Times New Roman"/>
-                <w:bCs/>
-                <w:sz w:val="24"/>
-                <w:szCs w:val="32"/>
-                <w:lang w:val="vi-VN"/>
-              </w:rPr>
-              <w:t>.4293</w:t>
-            </w:r>
-          </w:p>
-        </w:tc>
-      </w:tr>
-      <w:tr>
-        <w:trPr>
-          <w:jc w:val="center"/>
-        </w:trPr>
-        <w:tc>
-          <w:tcPr>
-            <w:tcW w:w="4509" w:type="dxa"/>
-          </w:tcPr>
-          <w:p>
-            <w:pPr>
-              <w:pStyle w:val="Footer"/>
-              <w:spacing w:line="360" w:lineRule="auto"/>
-              <w:jc w:val="center"/>
-              <w:rPr>
-                <w:rFonts w:ascii="Times New Roman" w:hAnsi="Times New Roman" w:cs="Times New Roman"/>
-                <w:bCs/>
-                <w:sz w:val="24"/>
-                <w:szCs w:val="32"/>
-                <w:lang w:val="vi-VN"/>
-              </w:rPr>
-            </w:pPr>
-            <w:r>
-              <w:rPr>
-                <w:rFonts w:ascii="Times New Roman" w:hAnsi="Times New Roman" w:cs="Times New Roman"/>
-                <w:bCs/>
-                <w:sz w:val="24"/>
-                <w:szCs w:val="32"/>
-                <w:lang w:val="en-US"/>
-              </w:rPr>
-              <w:lastRenderedPageBreak/>
-              <w:t>1</w:t>
-            </w:r>
-            <w:r>
-              <w:rPr>
-                <w:rFonts w:ascii="Times New Roman" w:hAnsi="Times New Roman" w:cs="Times New Roman"/>
-                <w:bCs/>
-                <w:sz w:val="24"/>
-                <w:szCs w:val="32"/>
-                <w:lang w:val="vi-VN"/>
-              </w:rPr>
-              <w:t>.0</w:t>
-            </w:r>
-          </w:p>
-        </w:tc>
-        <w:tc>
-          <w:tcPr>
-            <w:tcW w:w="4510" w:type="dxa"/>
-          </w:tcPr>
-          <w:p>
-            <w:pPr>
-              <w:pStyle w:val="Footer"/>
-              <w:spacing w:line="360" w:lineRule="auto"/>
-              <w:jc w:val="center"/>
-              <w:rPr>
-                <w:rFonts w:ascii="Times New Roman" w:hAnsi="Times New Roman" w:cs="Times New Roman"/>
-                <w:bCs/>
-                <w:sz w:val="24"/>
-                <w:szCs w:val="32"/>
-                <w:lang w:val="en-US"/>
-              </w:rPr>
-            </w:pPr>
-            <m:oMathPara>
-              <m:oMath>
-                <m:f>
-                  <m:fPr>
-                    <m:ctrlPr>
-                      <w:rPr>
-                        <w:rFonts w:ascii="Cambria Math" w:hAnsi="Cambria Math" w:cs="Times New Roman"/>
-                        <w:bCs/>
-                        <w:i/>
-                        <w:sz w:val="24"/>
-                        <w:szCs w:val="32"/>
-                        <w:lang w:val="en-US"/>
-                      </w:rPr>
-                    </m:ctrlPr>
-                  </m:fPr>
-                  <m:num>
-                    <m:r>
-                      <w:rPr>
-                        <w:rFonts w:ascii="Cambria Math" w:hAnsi="Cambria Math" w:cs="Times New Roman"/>
-                        <w:sz w:val="24"/>
-                        <w:szCs w:val="32"/>
-                        <w:lang w:val="en-US"/>
-                      </w:rPr>
-                      <m:t xml:space="preserve"> π</m:t>
-                    </m:r>
-                  </m:num>
-                  <m:den>
-                    <m:r>
-                      <w:rPr>
-                        <w:rFonts w:ascii="Cambria Math" w:hAnsi="Cambria Math" w:cs="Times New Roman"/>
-                        <w:sz w:val="24"/>
-                        <w:szCs w:val="32"/>
-                        <w:lang w:val="en-US"/>
-                      </w:rPr>
-                      <m:t>2</m:t>
-                    </m:r>
-                  </m:den>
-                </m:f>
-              </m:oMath>
-            </m:oMathPara>
-          </w:p>
-        </w:tc>
-      </w:tr>
-      <w:tr>
-        <w:trPr>
-          <w:jc w:val="center"/>
-        </w:trPr>
-        <w:tc>
-          <w:tcPr>
-            <w:tcW w:w="4509" w:type="dxa"/>
-          </w:tcPr>
-          <w:p>
-            <w:pPr>
-              <w:pStyle w:val="Footer"/>
-              <w:spacing w:line="360" w:lineRule="auto"/>
-              <w:jc w:val="center"/>
-              <w:rPr>
-                <w:rFonts w:ascii="Times New Roman" w:hAnsi="Times New Roman" w:cs="Times New Roman"/>
-                <w:bCs/>
-                <w:sz w:val="24"/>
-                <w:szCs w:val="32"/>
-                <w:lang w:val="vi-VN"/>
-              </w:rPr>
-            </w:pPr>
-            <w:r>
-              <w:rPr>
-                <w:rFonts w:ascii="Times New Roman" w:hAnsi="Times New Roman" w:cs="Times New Roman"/>
-                <w:bCs/>
-                <w:sz w:val="24"/>
-                <w:szCs w:val="32"/>
-                <w:lang w:val="vi-VN"/>
-              </w:rPr>
-              <w:t>-999.9</w:t>
-            </w:r>
-          </w:p>
-        </w:tc>
-        <w:tc>
-          <w:tcPr>
-            <w:tcW w:w="4510" w:type="dxa"/>
-          </w:tcPr>
-          <w:p>
-            <w:pPr>
-              <w:pStyle w:val="Footer"/>
-              <w:spacing w:line="360" w:lineRule="auto"/>
-              <w:jc w:val="center"/>
-              <w:rPr>
-                <w:rFonts w:ascii="Times New Roman" w:eastAsia="Cambria" w:hAnsi="Times New Roman" w:cs="Times New Roman"/>
-                <w:bCs/>
-                <w:sz w:val="24"/>
-                <w:szCs w:val="32"/>
-                <w:lang w:val="en-US"/>
-              </w:rPr>
-            </w:pPr>
-            <w:r>
-              <w:rPr>
-                <w:rFonts w:ascii="Times New Roman" w:eastAsia="Cambria" w:hAnsi="Times New Roman" w:cs="Times New Roman"/>
-                <w:bCs/>
-                <w:sz w:val="24"/>
-                <w:szCs w:val="32"/>
-                <w:lang w:val="vi-VN"/>
-              </w:rPr>
-              <w:t>NaN</w:t>
-            </w:r>
-          </w:p>
-        </w:tc>
-      </w:tr>
-      <w:tr>
-        <w:trPr>
-          <w:jc w:val="center"/>
-        </w:trPr>
-        <w:tc>
-          <w:tcPr>
-            <w:tcW w:w="4509" w:type="dxa"/>
-          </w:tcPr>
-          <w:p>
-            <w:pPr>
-              <w:pStyle w:val="Footer"/>
-              <w:spacing w:line="360" w:lineRule="auto"/>
-              <w:jc w:val="center"/>
-              <w:rPr>
-                <w:rFonts w:ascii="Times New Roman" w:hAnsi="Times New Roman" w:cs="Times New Roman"/>
-                <w:bCs/>
-                <w:sz w:val="24"/>
-                <w:szCs w:val="32"/>
-                <w:lang w:val="vi-VN"/>
-              </w:rPr>
-            </w:pPr>
-            <w:r>
-              <w:rPr>
-                <w:rFonts w:ascii="Times New Roman" w:hAnsi="Times New Roman" w:cs="Times New Roman"/>
-                <w:bCs/>
-                <w:sz w:val="24"/>
-                <w:szCs w:val="32"/>
-                <w:lang w:val="vi-VN"/>
-              </w:rPr>
-              <w:t>999.9</w:t>
-            </w:r>
-          </w:p>
-        </w:tc>
-        <w:tc>
-          <w:tcPr>
-            <w:tcW w:w="4510" w:type="dxa"/>
-          </w:tcPr>
-          <w:p>
-            <w:pPr>
-              <w:pStyle w:val="Footer"/>
-              <w:spacing w:line="360" w:lineRule="auto"/>
-              <w:jc w:val="center"/>
-              <w:rPr>
-                <w:rFonts w:ascii="Times New Roman" w:eastAsia="Cambria" w:hAnsi="Times New Roman" w:cs="Times New Roman"/>
-                <w:bCs/>
-                <w:sz w:val="24"/>
-                <w:szCs w:val="32"/>
-                <w:lang w:val="vi-VN"/>
-              </w:rPr>
-            </w:pPr>
-            <w:r>
-              <w:rPr>
-                <w:rFonts w:ascii="Times New Roman" w:eastAsia="Cambria" w:hAnsi="Times New Roman" w:cs="Times New Roman"/>
-                <w:bCs/>
-                <w:sz w:val="24"/>
-                <w:szCs w:val="32"/>
-                <w:lang w:val="vi-VN"/>
-              </w:rPr>
-              <w:t>NaN</w:t>
-            </w:r>
-          </w:p>
-        </w:tc>
-      </w:tr>
-      <w:tr>
-        <w:trPr>
-          <w:jc w:val="center"/>
-        </w:trPr>
-        <w:tc>
-          <w:tcPr>
-            <w:tcW w:w="4509" w:type="dxa"/>
-          </w:tcPr>
-          <w:p>
-            <w:pPr>
-              <w:pStyle w:val="Footer"/>
-              <w:spacing w:line="360" w:lineRule="auto"/>
-              <w:jc w:val="center"/>
-              <w:rPr>
-                <w:rFonts w:ascii="Times New Roman" w:hAnsi="Times New Roman" w:cs="Times New Roman"/>
-                <w:bCs/>
-                <w:sz w:val="24"/>
-                <w:szCs w:val="32"/>
-                <w:lang w:val="vi-VN"/>
-              </w:rPr>
-            </w:pPr>
-            <w:r>
-              <w:rPr>
-                <w:rFonts w:ascii="Times New Roman" w:hAnsi="Times New Roman" w:cs="Times New Roman"/>
-                <w:bCs/>
-                <w:sz w:val="24"/>
-                <w:szCs w:val="32"/>
-                <w:lang w:val="vi-VN"/>
-              </w:rPr>
-              <w:t>-1.0000001</w:t>
-            </w:r>
-          </w:p>
-        </w:tc>
-        <w:tc>
-          <w:tcPr>
-            <w:tcW w:w="4510" w:type="dxa"/>
-          </w:tcPr>
-          <w:p>
-            <w:pPr>
-              <w:pStyle w:val="Footer"/>
-              <w:spacing w:line="360" w:lineRule="auto"/>
-              <w:jc w:val="center"/>
-              <w:rPr>
-                <w:rFonts w:ascii="Times New Roman" w:eastAsia="Cambria" w:hAnsi="Times New Roman" w:cs="Times New Roman"/>
-                <w:bCs/>
-                <w:sz w:val="24"/>
-                <w:szCs w:val="32"/>
-                <w:lang w:val="vi-VN"/>
-              </w:rPr>
-            </w:pPr>
-            <w:r>
-              <w:rPr>
-                <w:rFonts w:ascii="Times New Roman" w:eastAsia="Cambria" w:hAnsi="Times New Roman" w:cs="Times New Roman"/>
-                <w:bCs/>
-                <w:sz w:val="24"/>
-                <w:szCs w:val="32"/>
-                <w:lang w:val="vi-VN"/>
-              </w:rPr>
-              <w:t>NaN</w:t>
-            </w:r>
-          </w:p>
-        </w:tc>
-      </w:tr>
-      <w:tr>
-        <w:trPr>
-          <w:jc w:val="center"/>
-        </w:trPr>
-        <w:tc>
-          <w:tcPr>
-            <w:tcW w:w="4509" w:type="dxa"/>
-          </w:tcPr>
-          <w:p>
-            <w:pPr>
-              <w:pStyle w:val="Footer"/>
-              <w:spacing w:line="360" w:lineRule="auto"/>
-              <w:jc w:val="center"/>
-              <w:rPr>
-                <w:rFonts w:ascii="Times New Roman" w:hAnsi="Times New Roman" w:cs="Times New Roman"/>
-                <w:bCs/>
-                <w:sz w:val="24"/>
-                <w:szCs w:val="32"/>
-                <w:lang w:val="vi-VN"/>
-              </w:rPr>
-            </w:pPr>
-            <w:r>
-              <w:rPr>
-                <w:rFonts w:ascii="Times New Roman" w:hAnsi="Times New Roman" w:cs="Times New Roman"/>
-                <w:bCs/>
-                <w:sz w:val="24"/>
-                <w:szCs w:val="32"/>
-                <w:lang w:val="vi-VN"/>
-              </w:rPr>
-              <w:t>1.0000001</w:t>
-            </w:r>
-          </w:p>
-        </w:tc>
-        <w:tc>
-          <w:tcPr>
-            <w:tcW w:w="4510" w:type="dxa"/>
-          </w:tcPr>
-          <w:p>
-            <w:pPr>
-              <w:pStyle w:val="Footer"/>
-              <w:spacing w:line="360" w:lineRule="auto"/>
-              <w:jc w:val="center"/>
-              <w:rPr>
-                <w:rFonts w:ascii="Times New Roman" w:eastAsia="Cambria" w:hAnsi="Times New Roman" w:cs="Times New Roman"/>
-                <w:bCs/>
-                <w:sz w:val="24"/>
-                <w:szCs w:val="32"/>
-                <w:lang w:val="vi-VN"/>
-              </w:rPr>
-            </w:pPr>
-            <w:r>
-              <w:rPr>
-                <w:rFonts w:ascii="Times New Roman" w:eastAsia="Cambria" w:hAnsi="Times New Roman" w:cs="Times New Roman"/>
-                <w:bCs/>
-                <w:sz w:val="24"/>
-                <w:szCs w:val="32"/>
-                <w:lang w:val="vi-VN"/>
-              </w:rPr>
-              <w:t>NaN</w:t>
-            </w:r>
-          </w:p>
-        </w:tc>
-      </w:tr>
-      <w:tr>
-        <w:trPr>
-          <w:jc w:val="center"/>
-        </w:trPr>
-        <w:tc>
-          <w:tcPr>
-            <w:tcW w:w="4509" w:type="dxa"/>
-          </w:tcPr>
-          <w:p>
-            <w:pPr>
-              <w:pStyle w:val="Footer"/>
-              <w:spacing w:line="360" w:lineRule="auto"/>
-              <w:jc w:val="center"/>
-              <w:rPr>
-                <w:rFonts w:ascii="Times New Roman" w:hAnsi="Times New Roman" w:cs="Times New Roman"/>
-                <w:bCs/>
-                <w:sz w:val="24"/>
-                <w:szCs w:val="32"/>
-                <w:lang w:val="vi-VN"/>
-              </w:rPr>
-            </w:pPr>
-            <w:r>
-              <w:rPr>
-                <w:rFonts w:ascii="Times New Roman" w:hAnsi="Times New Roman" w:cs="Times New Roman"/>
-                <w:bCs/>
-                <w:sz w:val="24"/>
-                <w:szCs w:val="32"/>
-                <w:lang w:val="vi-VN"/>
-              </w:rPr>
-              <w:t>Double.NaN</w:t>
-            </w:r>
-          </w:p>
-        </w:tc>
-        <w:tc>
-          <w:tcPr>
-            <w:tcW w:w="4510" w:type="dxa"/>
-          </w:tcPr>
-          <w:p>
-            <w:pPr>
-              <w:pStyle w:val="Footer"/>
-              <w:spacing w:line="360" w:lineRule="auto"/>
-              <w:jc w:val="center"/>
-              <w:rPr>
-                <w:rFonts w:ascii="Times New Roman" w:eastAsia="Cambria" w:hAnsi="Times New Roman" w:cs="Times New Roman"/>
-                <w:bCs/>
-                <w:sz w:val="24"/>
-                <w:szCs w:val="32"/>
-                <w:lang w:val="vi-VN"/>
-              </w:rPr>
-            </w:pPr>
-            <w:r>
-              <w:rPr>
-                <w:rFonts w:ascii="Times New Roman" w:eastAsia="Cambria" w:hAnsi="Times New Roman" w:cs="Times New Roman"/>
-                <w:bCs/>
-                <w:sz w:val="24"/>
-                <w:szCs w:val="32"/>
-                <w:lang w:val="vi-VN"/>
-              </w:rPr>
-              <w:t>NaN</w:t>
-            </w:r>
-          </w:p>
-        </w:tc>
-      </w:tr>
-      <w:tr>
-        <w:trPr>
-          <w:jc w:val="center"/>
-        </w:trPr>
-        <w:tc>
-          <w:tcPr>
-            <w:tcW w:w="4509" w:type="dxa"/>
-          </w:tcPr>
-          <w:p>
-            <w:pPr>
-              <w:pStyle w:val="Footer"/>
-              <w:spacing w:line="360" w:lineRule="auto"/>
-              <w:jc w:val="center"/>
-              <w:rPr>
-                <w:rFonts w:ascii="Times New Roman" w:hAnsi="Times New Roman" w:cs="Times New Roman"/>
-                <w:bCs/>
-                <w:sz w:val="24"/>
-                <w:szCs w:val="32"/>
-                <w:lang w:val="en-US"/>
-              </w:rPr>
-            </w:pPr>
-            <w:r>
-              <w:rPr>
-                <w:rFonts w:ascii="Times New Roman" w:hAnsi="Times New Roman" w:cs="Times New Roman"/>
-                <w:bCs/>
-                <w:sz w:val="24"/>
-                <w:szCs w:val="32"/>
-                <w:lang w:val="vi-VN"/>
-              </w:rPr>
-              <w:t>Double.POSITIVE_</w:t>
-            </w:r>
-            <w:r>
-              <w:rPr>
-                <w:rFonts w:ascii="Times New Roman" w:hAnsi="Times New Roman" w:cs="Times New Roman"/>
-                <w:bCs/>
-                <w:sz w:val="24"/>
-                <w:szCs w:val="32"/>
-                <w:lang w:val="en-US"/>
-              </w:rPr>
-              <w:t>INFINITY</w:t>
-            </w:r>
-          </w:p>
-        </w:tc>
-        <w:tc>
-          <w:tcPr>
-            <w:tcW w:w="4510" w:type="dxa"/>
-          </w:tcPr>
-          <w:p>
-            <w:pPr>
-              <w:pStyle w:val="Footer"/>
-              <w:spacing w:line="360" w:lineRule="auto"/>
-              <w:jc w:val="center"/>
-              <w:rPr>
-                <w:rFonts w:ascii="Times New Roman" w:eastAsia="Cambria" w:hAnsi="Times New Roman" w:cs="Times New Roman"/>
-                <w:bCs/>
-                <w:sz w:val="24"/>
-                <w:szCs w:val="32"/>
-                <w:lang w:val="vi-VN"/>
-              </w:rPr>
-            </w:pPr>
-            <w:r>
-              <w:rPr>
-                <w:rFonts w:ascii="Times New Roman" w:eastAsia="Cambria" w:hAnsi="Times New Roman" w:cs="Times New Roman"/>
-                <w:bCs/>
-                <w:sz w:val="24"/>
-                <w:szCs w:val="32"/>
-                <w:lang w:val="vi-VN"/>
-              </w:rPr>
-              <w:t>NaN</w:t>
-            </w:r>
-          </w:p>
-        </w:tc>
-      </w:tr>
-      <w:tr>
-        <w:trPr>
-          <w:jc w:val="center"/>
-        </w:trPr>
-        <w:tc>
-          <w:tcPr>
-            <w:tcW w:w="4509" w:type="dxa"/>
-          </w:tcPr>
-          <w:p>
-            <w:pPr>
-              <w:pStyle w:val="Footer"/>
-              <w:spacing w:line="360" w:lineRule="auto"/>
-              <w:jc w:val="center"/>
-              <w:rPr>
-                <w:rFonts w:ascii="Times New Roman" w:hAnsi="Times New Roman" w:cs="Times New Roman"/>
-                <w:bCs/>
-                <w:sz w:val="24"/>
-                <w:szCs w:val="32"/>
-                <w:lang w:val="en-US"/>
-              </w:rPr>
-            </w:pPr>
-            <w:r>
-              <w:rPr>
-                <w:rFonts w:ascii="Times New Roman" w:hAnsi="Times New Roman" w:cs="Times New Roman"/>
-                <w:bCs/>
-                <w:sz w:val="24"/>
-                <w:szCs w:val="32"/>
-                <w:lang w:val="en-US"/>
-              </w:rPr>
-              <w:t>Double.MIN_VALUE</w:t>
-            </w:r>
-          </w:p>
-        </w:tc>
-        <w:tc>
-          <w:tcPr>
-            <w:tcW w:w="4510" w:type="dxa"/>
-          </w:tcPr>
-          <w:p>
-            <w:pPr>
-              <w:pStyle w:val="Footer"/>
-              <w:spacing w:line="360" w:lineRule="auto"/>
-              <w:jc w:val="center"/>
-              <w:rPr>
-                <w:rFonts w:ascii="Times New Roman" w:eastAsia="Cambria" w:hAnsi="Times New Roman" w:cs="Times New Roman"/>
-                <w:bCs/>
-                <w:sz w:val="24"/>
-                <w:szCs w:val="32"/>
-              </w:rPr>
-            </w:pPr>
-            <m:oMath>
-              <m:r>
-                <w:rPr>
-                  <w:rFonts w:ascii="Cambria Math" w:eastAsia="Cambria" w:hAnsi="Cambria Math" w:cs="Times New Roman"/>
-                  <w:sz w:val="24"/>
-                  <w:szCs w:val="32"/>
-                  <w:lang w:val="ru"/>
-                </w:rPr>
-                <m:t>4,</m:t>
-              </m:r>
-              <m:r>
-                <w:rPr>
-                  <w:rFonts w:ascii="Cambria Math" w:eastAsia="Cambria" w:hAnsi="Cambria Math" w:cs="Times New Roman"/>
-                  <w:sz w:val="24"/>
-                  <w:szCs w:val="32"/>
-                  <w:lang w:val="en-US"/>
-                </w:rPr>
-                <m:t xml:space="preserve">9 . </m:t>
-              </m:r>
-              <m:sSup>
-                <m:sSupPr>
-                  <m:ctrlPr>
-                    <w:rPr>
-                      <w:rFonts w:ascii="Cambria Math" w:eastAsia="Cambria" w:hAnsi="Cambria Math" w:cs="Times New Roman"/>
-                      <w:bCs/>
-                      <w:i/>
-                      <w:sz w:val="24"/>
-                      <w:szCs w:val="32"/>
-                      <w:lang w:val="en-US"/>
-                    </w:rPr>
-                  </m:ctrlPr>
-                </m:sSupPr>
-                <m:e>
-                  <m:r>
-                    <w:rPr>
-                      <w:rFonts w:ascii="Cambria Math" w:eastAsia="Cambria" w:hAnsi="Cambria Math" w:cs="Times New Roman"/>
-                      <w:sz w:val="24"/>
-                      <w:szCs w:val="32"/>
-                      <w:lang w:val="en-US"/>
-                    </w:rPr>
-                    <m:t>10</m:t>
-                  </m:r>
-                </m:e>
-                <m:sup>
-                  <m:r>
-                    <w:rPr>
-                      <w:rFonts w:ascii="Cambria Math" w:eastAsia="Cambria" w:hAnsi="Cambria Math" w:cs="Times New Roman"/>
-                      <w:sz w:val="24"/>
-                      <w:szCs w:val="32"/>
-                      <w:lang w:val="en-US"/>
-                    </w:rPr>
-                    <m:t>-324</m:t>
-                  </m:r>
-                </m:sup>
-              </m:sSup>
-            </m:oMath>
-            <w:r>
-              <w:rPr>
-                <w:rFonts w:ascii="Times New Roman" w:eastAsia="Cambria" w:hAnsi="Times New Roman" w:cs="Times New Roman"/>
-                <w:bCs/>
-                <w:sz w:val="24"/>
-                <w:szCs w:val="32"/>
-                <w:lang w:val="ru"/>
-              </w:rPr>
-              <w:t xml:space="preserve">(и </w:t>
-            </w:r>
-            <m:oMath>
-              <m:r>
-                <w:rPr>
-                  <w:rFonts w:ascii="Cambria Math" w:eastAsia="Cambria" w:hAnsi="Cambria Math" w:cs="Times New Roman"/>
-                  <w:sz w:val="24"/>
-                  <w:szCs w:val="32"/>
-                  <w:lang w:val="ru"/>
-                </w:rPr>
-                <m:t>asin(x)≈x</m:t>
-              </m:r>
-            </m:oMath>
-            <w:r>
-              <w:rPr>
-                <w:rFonts w:ascii="Times New Roman" w:eastAsia="Cambria" w:hAnsi="Times New Roman" w:cs="Times New Roman"/>
-                <w:bCs/>
-                <w:sz w:val="24"/>
-                <w:szCs w:val="32"/>
-                <w:lang w:val="ru"/>
-              </w:rPr>
-              <w:t>)</w:t>
-            </w:r>
-          </w:p>
-        </w:tc>
-      </w:tr>
-    </w:tbl>
-    <w:p>
-      <w:pPr>
-        <w:pStyle w:val="Footer"/>
-        <w:spacing w:line="360" w:lineRule="auto"/>
-        <w:ind w:left="360"/>
-        <w:jc w:val="both"/>
-        <w:rPr>
-          <w:rFonts w:ascii="Times New Roman" w:hAnsi="Times New Roman" w:cs="Times New Roman"/>
-          <w:bCs/>
-          <w:sz w:val="24"/>
-          <w:szCs w:val="32"/>
-          <w:lang w:val="vi-VN"/>
-        </w:rPr>
-      </w:pPr>
     </w:p>
     <w:p>
       <w:pPr>
@@ -4971,7 +3735,7 @@
                     <pic:cNvPicPr/>
                   </pic:nvPicPr>
                   <pic:blipFill>
-                    <a:blip r:embed="rId9"/>
+                    <a:blip r:embed="rId8"/>
                     <a:stretch>
                       <a:fillRect/>
                     </a:stretch>
@@ -5041,7 +3805,7 @@
                     <pic:cNvPicPr/>
                   </pic:nvPicPr>
                   <pic:blipFill>
-                    <a:blip r:embed="rId10"/>
+                    <a:blip r:embed="rId9"/>
                     <a:stretch>
                       <a:fillRect/>
                     </a:stretch>
@@ -5061,230 +3825,225 @@
           </wp:inline>
         </w:drawing>
       </w:r>
+      <w:r>
+        <w:rPr>
+          <w:rFonts w:ascii="Times New Roman" w:hAnsi="Times New Roman" w:cs="Times New Roman"/>
+          <w:sz w:val="24"/>
+          <w:szCs w:val="32"/>
+        </w:rPr>
+        <w:tab/>
+      </w:r>
+    </w:p>
+    <w:p>
+      <w:pPr>
+        <w:spacing w:line="360" w:lineRule="auto"/>
+        <w:ind w:firstLine="720"/>
+        <w:jc w:val="both"/>
+        <w:rPr>
+          <w:rFonts w:ascii="Times New Roman" w:hAnsi="Times New Roman" w:cs="Times New Roman"/>
+          <w:sz w:val="24"/>
+          <w:szCs w:val="24"/>
+          <w:lang w:val="ru-RU"/>
+        </w:rPr>
+      </w:pPr>
+      <w:r>
+        <w:rPr>
+          <w:rFonts w:ascii="Times New Roman" w:hAnsi="Times New Roman" w:cs="Times New Roman"/>
+          <w:sz w:val="24"/>
+          <w:szCs w:val="24"/>
+          <w:lang w:val="ru-RU"/>
+        </w:rPr>
+        <w:t>Функция arcsin(x) корректно обрабатываются все выбранные тестовые случаи, включая граничные и специальные значения, а также проверяются свойства функции (нечётность, монотонность) и корректность первых членов разложения в ряд.</w:t>
+      </w:r>
+    </w:p>
+    <w:p>
+      <w:pPr>
+        <w:spacing w:line="360" w:lineRule="auto"/>
+        <w:ind w:firstLine="720"/>
+        <w:jc w:val="both"/>
+        <w:rPr>
+          <w:rFonts w:ascii="Times New Roman" w:hAnsi="Times New Roman" w:cs="Times New Roman"/>
+          <w:sz w:val="24"/>
+          <w:szCs w:val="24"/>
+          <w:lang w:val="ru-RU"/>
+        </w:rPr>
+      </w:pPr>
+      <w:r>
+        <w:rPr>
+          <w:rFonts w:ascii="Times New Roman" w:hAnsi="Times New Roman" w:cs="Times New Roman"/>
+          <w:sz w:val="24"/>
+          <w:szCs w:val="24"/>
+          <w:lang w:val="ru-RU"/>
+        </w:rPr>
+        <w:t xml:space="preserve">Для допустимых x </w:t>
+      </w:r>
+      <w:r>
+        <w:rPr>
+          <w:rFonts w:ascii="Cambria Math" w:hAnsi="Cambria Math" w:cs="Cambria Math"/>
+          <w:sz w:val="24"/>
+          <w:szCs w:val="24"/>
+          <w:lang w:val="ru-RU"/>
+        </w:rPr>
+        <w:t>∈</w:t>
+      </w:r>
+      <w:r>
+        <w:rPr>
+          <w:rFonts w:ascii="Times New Roman" w:hAnsi="Times New Roman" w:cs="Times New Roman"/>
+          <w:sz w:val="24"/>
+          <w:szCs w:val="24"/>
+          <w:lang w:val="ru-RU"/>
+        </w:rPr>
+        <w:t xml:space="preserve"> [-1; 1] результаты совпадают с эталонной реализацией Math.asin в пределах заданной погрешности, при этом для значений, близких к ±1, используется более мягкий допуск из-за медленной сходимости ряда.</w:t>
+      </w:r>
+    </w:p>
+    <w:p>
+      <w:pPr>
+        <w:spacing w:line="360" w:lineRule="auto"/>
+        <w:ind w:firstLine="720"/>
+        <w:jc w:val="both"/>
+        <w:rPr>
+          <w:rFonts w:ascii="Times New Roman" w:hAnsi="Times New Roman" w:cs="Times New Roman"/>
+          <w:sz w:val="24"/>
+          <w:szCs w:val="24"/>
+          <w:lang w:val="ru-RU"/>
+        </w:rPr>
+      </w:pPr>
+      <w:r>
+        <w:rPr>
+          <w:rFonts w:ascii="Times New Roman" w:hAnsi="Times New Roman" w:cs="Times New Roman"/>
+          <w:sz w:val="24"/>
+          <w:szCs w:val="24"/>
+          <w:lang w:val="ru-RU"/>
+        </w:rPr>
+        <w:t xml:space="preserve">Для значений вне области определения, а также для NaN и ±Infinity, </w:t>
+      </w:r>
+      <w:r>
+        <w:rPr>
+          <w:rFonts w:ascii="Times New Roman" w:hAnsi="Times New Roman" w:cs="Times New Roman"/>
+          <w:sz w:val="24"/>
+          <w:szCs w:val="24"/>
+          <w:lang w:val="ru-RU"/>
+        </w:rPr>
+        <w:t xml:space="preserve">возвращается </w:t>
+      </w:r>
+      <w:proofErr w:type="spellStart"/>
+      <w:r>
+        <w:rPr>
+          <w:rFonts w:ascii="Times New Roman" w:hAnsi="Times New Roman" w:cs="Times New Roman"/>
+          <w:sz w:val="24"/>
+          <w:szCs w:val="24"/>
+          <w:lang w:val="en-US"/>
+        </w:rPr>
+        <w:t>NaN</w:t>
+      </w:r>
+      <w:proofErr w:type="spellEnd"/>
+      <w:r>
+        <w:rPr>
+          <w:rFonts w:ascii="Times New Roman" w:hAnsi="Times New Roman" w:cs="Times New Roman"/>
+          <w:sz w:val="24"/>
+          <w:szCs w:val="24"/>
+          <w:lang w:val="ru-RU"/>
+        </w:rPr>
+        <w:t>.</w:t>
+      </w:r>
+    </w:p>
+    <w:p>
+      <w:pPr>
+        <w:spacing w:line="360" w:lineRule="auto"/>
+        <w:ind w:firstLine="630"/>
+        <w:jc w:val="both"/>
+        <w:rPr>
+          <w:rFonts w:ascii="Times New Roman" w:hAnsi="Times New Roman" w:cs="Times New Roman"/>
+          <w:sz w:val="24"/>
+          <w:szCs w:val="24"/>
+          <w:lang w:val="ru-RU"/>
+        </w:rPr>
+      </w:pPr>
+      <w:r>
+        <w:rPr>
+          <w:rFonts w:ascii="Times New Roman" w:hAnsi="Times New Roman" w:cs="Times New Roman"/>
+          <w:sz w:val="24"/>
+          <w:szCs w:val="24"/>
+          <w:lang w:val="ru-RU"/>
+        </w:rPr>
+        <w:t>Отдельно проверено сохранение знака -0.0 на уровне битового представления, что подтверждает корректную обработку нулевых значений.</w:t>
+      </w:r>
+    </w:p>
+    <w:p>
+      <w:pPr>
+        <w:spacing w:line="360" w:lineRule="auto"/>
+        <w:ind w:firstLine="630"/>
+        <w:jc w:val="both"/>
+        <w:rPr>
+          <w:rFonts w:ascii="Times New Roman" w:hAnsi="Times New Roman" w:cs="Times New Roman"/>
+          <w:sz w:val="24"/>
+          <w:szCs w:val="24"/>
+          <w:lang w:val="ru-RU"/>
+        </w:rPr>
+      </w:pPr>
     </w:p>
     <w:p>
       <w:pPr>
         <w:pStyle w:val="Footer"/>
         <w:spacing w:line="360" w:lineRule="auto"/>
         <w:jc w:val="both"/>
-        <w:rPr>
-          <w:rFonts w:ascii="Times New Roman" w:hAnsi="Times New Roman" w:cs="Times New Roman"/>
-          <w:sz w:val="24"/>
-          <w:szCs w:val="32"/>
-        </w:rPr>
-      </w:pPr>
-      <w:r>
-        <w:rPr>
-          <w:rFonts w:ascii="Times New Roman" w:hAnsi="Times New Roman" w:cs="Times New Roman"/>
-          <w:sz w:val="24"/>
-          <w:szCs w:val="32"/>
-        </w:rPr>
-        <w:tab/>
-      </w:r>
-    </w:p>
-    <w:p>
-      <w:pPr>
+        <w:outlineLvl w:val="1"/>
+        <w:rPr>
+          <w:rFonts w:ascii="Times New Roman" w:hAnsi="Times New Roman" w:cs="Times New Roman"/>
+          <w:b/>
+          <w:sz w:val="24"/>
+          <w:szCs w:val="32"/>
+        </w:rPr>
+      </w:pPr>
+      <w:bookmarkStart w:id="3" w:name="_Toc221794999"/>
+      <w:r>
+        <w:rPr>
+          <w:rFonts w:ascii="Times New Roman" w:hAnsi="Times New Roman" w:cs="Times New Roman"/>
+          <w:b/>
+          <w:sz w:val="24"/>
+          <w:szCs w:val="32"/>
+        </w:rPr>
+        <w:t xml:space="preserve">Задание 2: </w:t>
+      </w:r>
+      <w:proofErr w:type="spellStart"/>
+      <w:r>
+        <w:rPr>
+          <w:rFonts w:ascii="Times New Roman" w:hAnsi="Times New Roman" w:cs="Times New Roman"/>
+          <w:b/>
+          <w:sz w:val="24"/>
+          <w:szCs w:val="32"/>
+          <w:lang w:val="en-US"/>
+        </w:rPr>
+        <w:t>BucketSort</w:t>
+      </w:r>
+      <w:bookmarkEnd w:id="3"/>
+      <w:proofErr w:type="spellEnd"/>
+    </w:p>
+    <w:p>
+      <w:pPr>
+        <w:pStyle w:val="Footer"/>
         <w:spacing w:line="360" w:lineRule="auto"/>
         <w:ind w:firstLine="720"/>
         <w:jc w:val="both"/>
         <w:rPr>
           <w:rFonts w:ascii="Times New Roman" w:hAnsi="Times New Roman" w:cs="Times New Roman"/>
-          <w:sz w:val="24"/>
-          <w:szCs w:val="24"/>
-          <w:lang w:val="ru-RU"/>
-        </w:rPr>
-      </w:pPr>
-      <w:r>
-        <w:rPr>
-          <w:rFonts w:ascii="Times New Roman" w:hAnsi="Times New Roman" w:cs="Times New Roman"/>
-          <w:sz w:val="24"/>
-          <w:szCs w:val="24"/>
-          <w:lang w:val="ru-RU"/>
-        </w:rPr>
-        <w:t>Функция arcsin(x) корректно обрабатываются все выбранные тестовые случаи, включая граничные и специальные значения, а также проверяются свойства функции (нечётность, монотонность) и корректность первых членов разложения в ряд.</w:t>
-      </w:r>
-    </w:p>
-    <w:p>
-      <w:pPr>
-        <w:spacing w:line="360" w:lineRule="auto"/>
-        <w:ind w:firstLine="720"/>
-        <w:jc w:val="both"/>
-        <w:rPr>
-          <w:rFonts w:ascii="Times New Roman" w:hAnsi="Times New Roman" w:cs="Times New Roman"/>
-          <w:sz w:val="24"/>
-          <w:szCs w:val="24"/>
-          <w:lang w:val="ru-RU"/>
-        </w:rPr>
-      </w:pPr>
-      <w:r>
-        <w:rPr>
-          <w:rFonts w:ascii="Times New Roman" w:hAnsi="Times New Roman" w:cs="Times New Roman"/>
-          <w:sz w:val="24"/>
-          <w:szCs w:val="24"/>
-          <w:lang w:val="ru-RU"/>
-        </w:rPr>
-        <w:t xml:space="preserve">Для допустимых x </w:t>
-      </w:r>
-      <w:r>
-        <w:rPr>
-          <w:rFonts w:ascii="Cambria Math" w:hAnsi="Cambria Math" w:cs="Cambria Math"/>
-          <w:sz w:val="24"/>
-          <w:szCs w:val="24"/>
-          <w:lang w:val="ru-RU"/>
-        </w:rPr>
-        <w:t>∈</w:t>
-      </w:r>
-      <w:r>
-        <w:rPr>
-          <w:rFonts w:ascii="Times New Roman" w:hAnsi="Times New Roman" w:cs="Times New Roman"/>
-          <w:sz w:val="24"/>
-          <w:szCs w:val="24"/>
-          <w:lang w:val="ru-RU"/>
-        </w:rPr>
-        <w:t xml:space="preserve"> [-1; 1] результаты совпадают с эталонной реализацией Math.asin в пределах заданной погрешности, при этом для значений, близких к ±1, используется более мягкий допуск из-за медленной сходимости ряда.</w:t>
-      </w:r>
-    </w:p>
-    <w:p>
-      <w:pPr>
-        <w:spacing w:line="360" w:lineRule="auto"/>
-        <w:ind w:firstLine="720"/>
-        <w:jc w:val="both"/>
-        <w:rPr>
-          <w:rFonts w:ascii="Times New Roman" w:hAnsi="Times New Roman" w:cs="Times New Roman"/>
-          <w:sz w:val="24"/>
-          <w:szCs w:val="24"/>
-          <w:lang w:val="ru-RU"/>
-        </w:rPr>
-      </w:pPr>
-      <w:r>
-        <w:rPr>
-          <w:rFonts w:ascii="Times New Roman" w:hAnsi="Times New Roman" w:cs="Times New Roman"/>
-          <w:sz w:val="24"/>
-          <w:szCs w:val="24"/>
-          <w:lang w:val="ru-RU"/>
-        </w:rPr>
-        <w:lastRenderedPageBreak/>
-        <w:t xml:space="preserve">Для значений вне области определения, а также для NaN и ±Infinity, </w:t>
-      </w:r>
-      <w:r>
-        <w:rPr>
-          <w:rFonts w:ascii="Times New Roman" w:hAnsi="Times New Roman" w:cs="Times New Roman"/>
-          <w:sz w:val="24"/>
-          <w:szCs w:val="24"/>
-          <w:lang w:val="ru-RU"/>
-        </w:rPr>
-        <w:t xml:space="preserve">возвращается </w:t>
-      </w:r>
-      <w:r>
-        <w:rPr>
-          <w:rFonts w:ascii="Times New Roman" w:hAnsi="Times New Roman" w:cs="Times New Roman"/>
-          <w:sz w:val="24"/>
-          <w:szCs w:val="24"/>
+          <w:bCs/>
+          <w:sz w:val="24"/>
+          <w:szCs w:val="32"/>
+        </w:rPr>
+      </w:pPr>
+      <w:proofErr w:type="spellStart"/>
+      <w:r>
+        <w:rPr>
+          <w:rFonts w:ascii="Times New Roman" w:hAnsi="Times New Roman" w:cs="Times New Roman"/>
+          <w:b/>
+          <w:sz w:val="24"/>
+          <w:szCs w:val="32"/>
           <w:lang w:val="en-US"/>
         </w:rPr>
-        <w:t>NaN</w:t>
-      </w:r>
-      <w:r>
-        <w:rPr>
-          <w:rFonts w:ascii="Times New Roman" w:hAnsi="Times New Roman" w:cs="Times New Roman"/>
-          <w:sz w:val="24"/>
-          <w:szCs w:val="24"/>
-          <w:lang w:val="ru-RU"/>
-        </w:rPr>
-        <w:t>.</w:t>
-      </w:r>
-    </w:p>
-    <w:p>
-      <w:pPr>
-        <w:spacing w:line="360" w:lineRule="auto"/>
-        <w:ind w:firstLine="630"/>
-        <w:jc w:val="both"/>
-        <w:rPr>
-          <w:rFonts w:ascii="Times New Roman" w:hAnsi="Times New Roman" w:cs="Times New Roman"/>
-          <w:sz w:val="24"/>
-          <w:szCs w:val="24"/>
-          <w:lang w:val="ru-RU"/>
-        </w:rPr>
-      </w:pPr>
-      <w:r>
-        <w:rPr>
-          <w:rFonts w:ascii="Times New Roman" w:hAnsi="Times New Roman" w:cs="Times New Roman"/>
-          <w:sz w:val="24"/>
-          <w:szCs w:val="24"/>
-          <w:lang w:val="ru-RU"/>
-        </w:rPr>
-        <w:t>Отдельно проверено сохранение знака -0.0 на уровне битового представления, что подтверждает корректную обработку нулевых значений.</w:t>
-      </w:r>
-    </w:p>
-    <w:p>
-      <w:pPr>
-        <w:spacing w:line="360" w:lineRule="auto"/>
-        <w:ind w:firstLine="630"/>
-        <w:jc w:val="both"/>
-        <w:rPr>
-          <w:rFonts w:ascii="Times New Roman" w:hAnsi="Times New Roman" w:cs="Times New Roman"/>
-          <w:sz w:val="24"/>
-          <w:szCs w:val="24"/>
-          <w:lang w:val="ru-RU"/>
-        </w:rPr>
-      </w:pPr>
-    </w:p>
-    <w:p>
-      <w:pPr>
-        <w:pStyle w:val="Footer"/>
-        <w:spacing w:line="360" w:lineRule="auto"/>
-        <w:jc w:val="both"/>
-        <w:outlineLvl w:val="0"/>
-        <w:rPr>
-          <w:rFonts w:ascii="Times New Roman" w:hAnsi="Times New Roman" w:cs="Times New Roman"/>
-          <w:b/>
-          <w:sz w:val="24"/>
-          <w:szCs w:val="32"/>
-        </w:rPr>
-      </w:pPr>
-      <w:r>
-        <w:rPr>
-          <w:rFonts w:ascii="Times New Roman" w:hAnsi="Times New Roman" w:cs="Times New Roman"/>
-          <w:b/>
-          <w:sz w:val="24"/>
-          <w:szCs w:val="32"/>
-        </w:rPr>
-        <w:t xml:space="preserve">Задание 2: </w:t>
-      </w:r>
-      <w:r>
-        <w:rPr>
-          <w:rFonts w:ascii="Times New Roman" w:hAnsi="Times New Roman" w:cs="Times New Roman"/>
-          <w:b/>
-          <w:sz w:val="24"/>
-          <w:szCs w:val="32"/>
-          <w:lang w:val="en-US"/>
-        </w:rPr>
         <w:t>BucketSort</w:t>
       </w:r>
-    </w:p>
-    <w:p>
-      <w:pPr>
-        <w:pStyle w:val="Footer"/>
-        <w:spacing w:line="360" w:lineRule="auto"/>
-        <w:ind w:firstLine="720"/>
-        <w:jc w:val="both"/>
-        <w:rPr>
-          <w:rFonts w:ascii="Times New Roman" w:hAnsi="Times New Roman" w:cs="Times New Roman"/>
-          <w:bCs/>
-          <w:sz w:val="24"/>
-          <w:szCs w:val="32"/>
-        </w:rPr>
-      </w:pPr>
-      <w:r>
-        <w:rPr>
-          <w:rFonts w:ascii="Times New Roman" w:hAnsi="Times New Roman" w:cs="Times New Roman"/>
-          <w:b/>
-          <w:sz w:val="24"/>
-          <w:szCs w:val="32"/>
-          <w:lang w:val="en-US"/>
-        </w:rPr>
-        <w:t>BucketSort</w:t>
-      </w:r>
+      <w:proofErr w:type="spellEnd"/>
       <w:r>
         <w:rPr>
           <w:rFonts w:ascii="Times New Roman" w:hAnsi="Times New Roman" w:cs="Times New Roman"/>
@@ -5301,61 +4060,7 @@
           <w:sz w:val="24"/>
           <w:szCs w:val="32"/>
         </w:rPr>
-        <w:t>это алгоритм сортировки, который распределяет элементы по бакетам в зависимости от их значения, сортирует содержимое кажд</w:t>
-      </w:r>
-      <w:r>
-        <w:rPr>
-          <w:rFonts w:ascii="Times New Roman" w:hAnsi="Times New Roman" w:cs="Times New Roman"/>
-          <w:bCs/>
-          <w:sz w:val="24"/>
-          <w:szCs w:val="32"/>
-        </w:rPr>
-        <w:t>ого</w:t>
-      </w:r>
-      <w:r>
-        <w:rPr>
-          <w:rFonts w:ascii="Times New Roman" w:hAnsi="Times New Roman" w:cs="Times New Roman"/>
-          <w:bCs/>
-          <w:sz w:val="24"/>
-          <w:szCs w:val="32"/>
-        </w:rPr>
-        <w:t xml:space="preserve"> </w:t>
-      </w:r>
-      <w:r>
-        <w:rPr>
-          <w:rFonts w:ascii="Times New Roman" w:hAnsi="Times New Roman" w:cs="Times New Roman"/>
-          <w:bCs/>
-          <w:sz w:val="24"/>
-          <w:szCs w:val="32"/>
-        </w:rPr>
-        <w:t>бакета</w:t>
-      </w:r>
-      <w:r>
-        <w:rPr>
-          <w:rFonts w:ascii="Times New Roman" w:hAnsi="Times New Roman" w:cs="Times New Roman"/>
-          <w:bCs/>
-          <w:sz w:val="24"/>
-          <w:szCs w:val="32"/>
-        </w:rPr>
-        <w:t xml:space="preserve"> и затем объединяет </w:t>
-      </w:r>
-      <w:r>
-        <w:rPr>
-          <w:rFonts w:ascii="Times New Roman" w:hAnsi="Times New Roman" w:cs="Times New Roman"/>
-          <w:bCs/>
-          <w:sz w:val="24"/>
-          <w:szCs w:val="32"/>
-        </w:rPr>
-        <w:t>бакет</w:t>
-      </w:r>
-      <w:r>
-        <w:rPr>
-          <w:rFonts w:ascii="Times New Roman" w:hAnsi="Times New Roman" w:cs="Times New Roman"/>
-          <w:bCs/>
-          <w:sz w:val="24"/>
-          <w:szCs w:val="32"/>
-        </w:rPr>
-        <w:t>ы в итоговый отсортированный массив.</w:t>
+        <w:t>это алгоритм сортировки, который распределяет элементы по бакетам в зависимости от их значения, сортирует содержимое каждого бакета и затем объединяет бакеты в итоговый отсортированный массив.</w:t>
       </w:r>
     </w:p>
     <w:p>
@@ -5937,7 +4642,6 @@
           <w:szCs w:val="24"/>
           <w:lang w:val="vi-VN"/>
         </w:rPr>
-        <w:lastRenderedPageBreak/>
         <w:t>массив из 1 элемента → `T1`;</w:t>
       </w:r>
     </w:p>
@@ -6018,6 +4722,7 @@
           <w:szCs w:val="24"/>
           <w:lang w:val="vi-VN"/>
         </w:rPr>
+        <w:lastRenderedPageBreak/>
         <w:t>Дополнительные проверки (вспомогательно)</w:t>
       </w:r>
     </w:p>
@@ -6177,7 +4882,7 @@
                     <pic:cNvPicPr/>
                   </pic:nvPicPr>
                   <pic:blipFill>
-                    <a:blip r:embed="rId11"/>
+                    <a:blip r:embed="rId10"/>
                     <a:stretch>
                       <a:fillRect/>
                     </a:stretch>
@@ -6229,7 +4934,7 @@
                     <pic:cNvPicPr/>
                   </pic:nvPicPr>
                   <pic:blipFill>
-                    <a:blip r:embed="rId12"/>
+                    <a:blip r:embed="rId11"/>
                     <a:stretch>
                       <a:fillRect/>
                     </a:stretch>
@@ -6328,8 +5033,48 @@
           <w:szCs w:val="24"/>
           <w:lang w:val="vi-VN"/>
         </w:rPr>
+        <w:t>Проверены крайние случаи: пустой массив/1 элемент (ранний выход), все элементы равны (range = 0), массивы с отрицательными/положительными значениями, повторами и «разреженными» значениями (много пустых бакетов).</w:t>
+      </w:r>
+    </w:p>
+    <w:p>
+      <w:pPr>
+        <w:spacing w:line="360" w:lineRule="auto"/>
+        <w:ind w:firstLine="720"/>
+        <w:jc w:val="both"/>
+        <w:rPr>
+          <w:rFonts w:ascii="Times New Roman" w:hAnsi="Times New Roman" w:cs="Times New Roman"/>
+          <w:sz w:val="24"/>
+          <w:szCs w:val="24"/>
+          <w:lang w:val="vi-VN"/>
+        </w:rPr>
+      </w:pPr>
+      <w:r>
+        <w:rPr>
+          <w:rFonts w:ascii="Times New Roman" w:hAnsi="Times New Roman" w:cs="Times New Roman"/>
+          <w:sz w:val="24"/>
+          <w:szCs w:val="24"/>
+          <w:lang w:val="vi-VN"/>
+        </w:rPr>
+        <w:t xml:space="preserve">Для выбранных наборов данных фиксировалась последовательность попадания в характерные точки (trace) и после нормализации сравнивалась с эталонной; во всех </w:t>
+      </w:r>
+      <w:r>
+        <w:rPr>
+          <w:rFonts w:ascii="Times New Roman" w:hAnsi="Times New Roman" w:cs="Times New Roman"/>
+          <w:sz w:val="24"/>
+          <w:szCs w:val="24"/>
+          <w:lang w:val="vi-VN"/>
+        </w:rPr>
         <w:lastRenderedPageBreak/>
-        <w:t>Проверены крайние случаи: пустой массив/1 элемент (ранний выход), все элементы равны (range = 0), массивы с отрицательными/положительными значениями, повторами и «разреженными» значениями (много пустых бакетов).</w:t>
+        <w:t>сценариях фактический trace соответствовал ожидаемому (проход по ветвлениям EARLY_RETURN, RANGE_ZERO, SKIP_EMPTY, SKIP_SINGLE, SORT_BUCKET, GATHER)</w:t>
+      </w:r>
+      <w:r>
+        <w:rPr>
+          <w:rFonts w:ascii="Times New Roman" w:hAnsi="Times New Roman" w:cs="Times New Roman"/>
+          <w:sz w:val="24"/>
+          <w:szCs w:val="24"/>
+          <w:lang w:val="vi-VN"/>
+        </w:rPr>
+        <w:t>.</w:t>
       </w:r>
     </w:p>
     <w:p>
@@ -6351,16 +5096,7 @@
           <w:szCs w:val="24"/>
           <w:lang w:val="vi-VN"/>
         </w:rPr>
-        <w:t>Для выбранных наборов данных фиксировалась последовательность попадания в характерные точки (trace) и после нормализации сравнивалась с эталонной; во всех сценариях фактический trace соответствовал ожидаемому (проход по ветвлениям EARLY_RETURN, RANGE_ZERO, SKIP_EMPTY, SKIP_SINGLE, SORT_BUCKET, GATHER)</w:t>
-      </w:r>
-      <w:r>
-        <w:rPr>
-          <w:rFonts w:ascii="Times New Roman" w:hAnsi="Times New Roman" w:cs="Times New Roman"/>
-          <w:sz w:val="24"/>
-          <w:szCs w:val="24"/>
-          <w:lang w:val="vi-VN"/>
-        </w:rPr>
-        <w:t>.</w:t>
+        <w:t>Некорректные входные данные (null, bucketCount &lt;= 0, NaN/Infinity) обрабатываются согласно контракту: выбрасывается IllegalArgumentException.</w:t>
       </w:r>
     </w:p>
     <w:p>
@@ -6375,35 +5111,13 @@
           <w:lang w:val="vi-VN"/>
         </w:rPr>
       </w:pPr>
-      <w:r>
-        <w:rPr>
-          <w:rFonts w:ascii="Times New Roman" w:hAnsi="Times New Roman" w:cs="Times New Roman"/>
-          <w:sz w:val="24"/>
-          <w:szCs w:val="24"/>
-          <w:lang w:val="vi-VN"/>
-        </w:rPr>
-        <w:t>Некорректные входные данные (null, bucketCount &lt;= 0, NaN/Infinity) обрабатываются согласно контракту: выбрасывается IllegalArgumentException.</w:t>
-      </w:r>
-    </w:p>
-    <w:p>
-      <w:pPr>
-        <w:spacing w:line="360" w:lineRule="auto"/>
-        <w:ind w:firstLine="720"/>
-        <w:jc w:val="both"/>
-        <w:rPr>
-          <w:rFonts w:ascii="Times New Roman" w:hAnsi="Times New Roman" w:cs="Times New Roman"/>
-          <w:sz w:val="24"/>
-          <w:szCs w:val="24"/>
-          <w:lang w:val="vi-VN"/>
-        </w:rPr>
-      </w:pPr>
     </w:p>
     <w:p>
       <w:pPr>
         <w:pStyle w:val="Footer"/>
         <w:spacing w:line="360" w:lineRule="auto"/>
         <w:jc w:val="both"/>
-        <w:outlineLvl w:val="0"/>
+        <w:outlineLvl w:val="1"/>
         <w:rPr>
           <w:rFonts w:ascii="Times New Roman" w:hAnsi="Times New Roman" w:cs="Times New Roman"/>
           <w:b/>
@@ -6412,6 +5126,7 @@
           <w:lang w:val="en-US"/>
         </w:rPr>
       </w:pPr>
+      <w:bookmarkStart w:id="4" w:name="_Toc221795000"/>
       <w:r>
         <w:rPr>
           <w:rFonts w:ascii="Times New Roman" w:hAnsi="Times New Roman" w:cs="Times New Roman"/>
@@ -6459,6 +5174,7 @@
         </w:rPr>
         <w:t>Описание предметной области</w:t>
       </w:r>
+      <w:bookmarkEnd w:id="4"/>
     </w:p>
     <w:p>
       <w:pPr>
@@ -6477,6 +5193,7 @@
         <w:rPr>
           <w:rFonts w:ascii="Times New Roman" w:hAnsi="Times New Roman" w:cs="Times New Roman"/>
           <w:b/>
+          <w:noProof/>
           <w:sz w:val="24"/>
           <w:szCs w:val="32"/>
           <w:lang w:val="vi-VN"/>
@@ -6497,7 +5214,7 @@
                     <pic:cNvPicPr/>
                   </pic:nvPicPr>
                   <pic:blipFill>
-                    <a:blip r:embed="rId13"/>
+                    <a:blip r:embed="rId12"/>
                     <a:stretch>
                       <a:fillRect/>
                     </a:stretch>
@@ -6659,7 +5376,6 @@
           <w:szCs w:val="32"/>
           <w:lang w:val="vi-VN"/>
         </w:rPr>
-        <w:lastRenderedPageBreak/>
         <w:t>Команды и контроллеры изменяют состояние сцены правильно.</w:t>
       </w:r>
     </w:p>
@@ -6783,6 +5499,7 @@
           <w:szCs w:val="32"/>
           <w:lang w:val="vi-VN"/>
         </w:rPr>
+        <w:lastRenderedPageBreak/>
         <w:t>Класс ModelVali</w:t>
       </w:r>
       <w:r>
@@ -7402,65 +6119,55 @@
           <w:szCs w:val="32"/>
           <w:lang w:val="vi-VN"/>
         </w:rPr>
-        <w:t xml:space="preserve">fullScenarioMatchesText: интеграционно проверяет сценарий из текста: рост звука двигателя, открытие шлюза, выброс Ford и Arthur в открытый космос, а также </w:t>
-      </w:r>
-      <w:r>
-        <w:rPr>
-          <w:rFonts w:ascii="Times New Roman" w:hAnsi="Times New Roman" w:cs="Times New Roman"/>
-          <w:bCs/>
-          <w:sz w:val="24"/>
-          <w:szCs w:val="32"/>
-          <w:lang w:val="vi-VN"/>
+        <w:t>fullScenarioMatchesText: интеграционно проверяет сценарий из текста: рост звука двигателя, открытие шлюза, выброс Ford и Arthur в открытый космос, а также корректный порядок событий (SoundTransitionEvent, SoundTransitionEvent, EjectionEvent).</w:t>
+      </w:r>
+    </w:p>
+    <w:p>
+      <w:pPr>
+        <w:pStyle w:val="Footer"/>
+        <w:spacing w:line="360" w:lineRule="auto"/>
+        <w:jc w:val="both"/>
+        <w:rPr>
+          <w:rFonts w:ascii="Times New Roman" w:hAnsi="Times New Roman" w:cs="Times New Roman"/>
+          <w:bCs/>
+          <w:sz w:val="24"/>
+          <w:szCs w:val="32"/>
+        </w:rPr>
+      </w:pPr>
+      <w:r>
+        <w:rPr>
+          <w:rFonts w:ascii="Times New Roman" w:hAnsi="Times New Roman" w:cs="Times New Roman"/>
+          <w:bCs/>
+          <w:sz w:val="24"/>
+          <w:szCs w:val="32"/>
+          <w:lang w:val="vi-VN"/>
+        </w:rPr>
+        <w:t>После написания тестов реализуем (или дорабатываем) сами классы в `part3` до полного прохождения тестов в стиле TDD.</w:t>
+      </w:r>
+    </w:p>
+    <w:p>
+      <w:pPr>
+        <w:pStyle w:val="Footer"/>
+        <w:spacing w:line="360" w:lineRule="auto"/>
+        <w:jc w:val="both"/>
+        <w:rPr>
+          <w:rFonts w:ascii="Times New Roman" w:hAnsi="Times New Roman" w:cs="Times New Roman"/>
+          <w:bCs/>
+          <w:sz w:val="24"/>
+          <w:szCs w:val="32"/>
+          <w:lang w:val="en-US"/>
+        </w:rPr>
+      </w:pPr>
+      <w:r>
+        <w:rPr>
+          <w:rFonts w:ascii="Times New Roman" w:hAnsi="Times New Roman" w:cs="Times New Roman"/>
+          <w:bCs/>
+          <w:noProof/>
+          <w:sz w:val="24"/>
+          <w:szCs w:val="32"/>
+          <w:lang w:val="en-US"/>
         </w:rPr>
         <w:lastRenderedPageBreak/>
-        <w:t>корректный порядок событий (SoundTransitionEvent, SoundTransitionEvent, EjectionEvent).</w:t>
-      </w:r>
-    </w:p>
-    <w:p>
-      <w:pPr>
-        <w:pStyle w:val="Footer"/>
-        <w:spacing w:line="360" w:lineRule="auto"/>
-        <w:jc w:val="both"/>
-        <w:rPr>
-          <w:rFonts w:ascii="Times New Roman" w:hAnsi="Times New Roman" w:cs="Times New Roman"/>
-          <w:bCs/>
-          <w:sz w:val="24"/>
-          <w:szCs w:val="32"/>
-          <w:lang w:val="en-US"/>
-        </w:rPr>
-      </w:pPr>
-      <w:r>
-        <w:rPr>
-          <w:rFonts w:ascii="Times New Roman" w:hAnsi="Times New Roman" w:cs="Times New Roman"/>
-          <w:bCs/>
-          <w:sz w:val="24"/>
-          <w:szCs w:val="32"/>
-          <w:lang w:val="vi-VN"/>
-        </w:rPr>
-        <w:t>После написания тестов реализуем (или дорабатываем) сами классы в `part3` до полного прохождения тестов в стиле TDD.</w:t>
-      </w:r>
-    </w:p>
-    <w:p>
-      <w:pPr>
-        <w:pStyle w:val="Footer"/>
-        <w:spacing w:line="360" w:lineRule="auto"/>
-        <w:jc w:val="both"/>
-        <w:rPr>
-          <w:rFonts w:ascii="Times New Roman" w:hAnsi="Times New Roman" w:cs="Times New Roman"/>
-          <w:bCs/>
-          <w:sz w:val="24"/>
-          <w:szCs w:val="32"/>
-          <w:lang w:val="en-US"/>
-        </w:rPr>
-      </w:pPr>
-      <w:r>
-        <w:rPr>
-          <w:rFonts w:ascii="Times New Roman" w:hAnsi="Times New Roman" w:cs="Times New Roman"/>
-          <w:bCs/>
-          <w:sz w:val="24"/>
-          <w:szCs w:val="32"/>
-          <w:lang w:val="en-US"/>
-        </w:rPr>
         <w:drawing>
           <wp:inline distT="0" distB="0" distL="0" distR="0" wp14:anchorId="0D0113BE" wp14:editId="1ABB5532">
             <wp:extent cx="5733415" cy="2912745"/>
@@ -7477,7 +6184,7 @@
                     <pic:cNvPicPr/>
                   </pic:nvPicPr>
                   <pic:blipFill>
-                    <a:blip r:embed="rId14"/>
+                    <a:blip r:embed="rId13"/>
                     <a:stretch>
                       <a:fillRect/>
                     </a:stretch>
@@ -7515,6 +6222,7 @@
         <w:rPr>
           <w:rFonts w:ascii="Times New Roman" w:hAnsi="Times New Roman" w:cs="Times New Roman"/>
           <w:bCs/>
+          <w:noProof/>
           <w:sz w:val="24"/>
           <w:szCs w:val="32"/>
           <w:lang w:val="en-US"/>
@@ -7535,7 +6243,7 @@
                     <pic:cNvPicPr/>
                   </pic:nvPicPr>
                   <pic:blipFill>
-                    <a:blip r:embed="rId15"/>
+                    <a:blip r:embed="rId14"/>
                     <a:stretch>
                       <a:fillRect/>
                     </a:stretch>
@@ -7561,25 +6269,37 @@
         <w:pStyle w:val="Footer"/>
         <w:numPr>
           <w:ilvl w:val="0"/>
-          <w:numId w:val="11"/>
+          <w:numId w:val="17"/>
         </w:numPr>
         <w:spacing w:line="360" w:lineRule="auto"/>
         <w:jc w:val="both"/>
-        <w:rPr>
-          <w:rFonts w:ascii="Times New Roman" w:hAnsi="Times New Roman" w:cs="Times New Roman"/>
-          <w:b/>
-          <w:sz w:val="24"/>
-          <w:szCs w:val="32"/>
-        </w:rPr>
-      </w:pPr>
-      <w:r>
-        <w:rPr>
-          <w:rFonts w:ascii="Times New Roman" w:hAnsi="Times New Roman" w:cs="Times New Roman"/>
-          <w:b/>
-          <w:sz w:val="24"/>
-          <w:szCs w:val="32"/>
-        </w:rPr>
-        <w:t xml:space="preserve">Вывод: </w:t>
+        <w:outlineLvl w:val="0"/>
+        <w:rPr>
+          <w:rFonts w:ascii="Times New Roman" w:hAnsi="Times New Roman" w:cs="Times New Roman"/>
+          <w:b/>
+          <w:sz w:val="24"/>
+          <w:szCs w:val="32"/>
+        </w:rPr>
+      </w:pPr>
+      <w:bookmarkStart w:id="5" w:name="_Toc221795001"/>
+      <w:r>
+        <w:rPr>
+          <w:rFonts w:ascii="Times New Roman" w:hAnsi="Times New Roman" w:cs="Times New Roman"/>
+          <w:b/>
+          <w:sz w:val="24"/>
+          <w:szCs w:val="32"/>
+        </w:rPr>
+        <w:t>Вывод:</w:t>
+      </w:r>
+      <w:bookmarkEnd w:id="5"/>
+      <w:r>
+        <w:rPr>
+          <w:rFonts w:ascii="Times New Roman" w:hAnsi="Times New Roman" w:cs="Times New Roman"/>
+          <w:b/>
+          <w:sz w:val="24"/>
+          <w:szCs w:val="32"/>
+        </w:rPr>
+        <w:t xml:space="preserve"> </w:t>
       </w:r>
     </w:p>
     <w:p>
@@ -8991,6 +7711,95 @@
     </w:lvl>
   </w:abstractNum>
   <w:abstractNum w:abstractNumId="13" w15:restartNumberingAfterBreak="0">
+    <w:nsid w:val="4E4B5FD8"/>
+    <w:multiLevelType w:val="hybridMultilevel"/>
+    <w:tmpl w:val="310E4294"/>
+    <w:lvl w:ilvl="0" w:tplc="B498A24E">
+      <w:start w:val="3"/>
+      <w:numFmt w:val="decimal"/>
+      <w:lvlText w:val="%1."/>
+      <w:lvlJc w:val="left"/>
+      <w:pPr>
+        <w:ind w:left="1080" w:hanging="360"/>
+      </w:pPr>
+      <w:rPr>
+        <w:rFonts w:hint="default"/>
+      </w:rPr>
+    </w:lvl>
+    <w:lvl w:ilvl="1" w:tplc="04090019" w:tentative="1">
+      <w:start w:val="1"/>
+      <w:numFmt w:val="lowerLetter"/>
+      <w:lvlText w:val="%2."/>
+      <w:lvlJc w:val="left"/>
+      <w:pPr>
+        <w:ind w:left="1800" w:hanging="360"/>
+      </w:pPr>
+    </w:lvl>
+    <w:lvl w:ilvl="2" w:tplc="0409001B" w:tentative="1">
+      <w:start w:val="1"/>
+      <w:numFmt w:val="lowerRoman"/>
+      <w:lvlText w:val="%3."/>
+      <w:lvlJc w:val="right"/>
+      <w:pPr>
+        <w:ind w:left="2520" w:hanging="180"/>
+      </w:pPr>
+    </w:lvl>
+    <w:lvl w:ilvl="3" w:tplc="0409000F" w:tentative="1">
+      <w:start w:val="1"/>
+      <w:numFmt w:val="decimal"/>
+      <w:lvlText w:val="%4."/>
+      <w:lvlJc w:val="left"/>
+      <w:pPr>
+        <w:ind w:left="3240" w:hanging="360"/>
+      </w:pPr>
+    </w:lvl>
+    <w:lvl w:ilvl="4" w:tplc="04090019" w:tentative="1">
+      <w:start w:val="1"/>
+      <w:numFmt w:val="lowerLetter"/>
+      <w:lvlText w:val="%5."/>
+      <w:lvlJc w:val="left"/>
+      <w:pPr>
+        <w:ind w:left="3960" w:hanging="360"/>
+      </w:pPr>
+    </w:lvl>
+    <w:lvl w:ilvl="5" w:tplc="0409001B" w:tentative="1">
+      <w:start w:val="1"/>
+      <w:numFmt w:val="lowerRoman"/>
+      <w:lvlText w:val="%6."/>
+      <w:lvlJc w:val="right"/>
+      <w:pPr>
+        <w:ind w:left="4680" w:hanging="180"/>
+      </w:pPr>
+    </w:lvl>
+    <w:lvl w:ilvl="6" w:tplc="0409000F" w:tentative="1">
+      <w:start w:val="1"/>
+      <w:numFmt w:val="decimal"/>
+      <w:lvlText w:val="%7."/>
+      <w:lvlJc w:val="left"/>
+      <w:pPr>
+        <w:ind w:left="5400" w:hanging="360"/>
+      </w:pPr>
+    </w:lvl>
+    <w:lvl w:ilvl="7" w:tplc="04090019" w:tentative="1">
+      <w:start w:val="1"/>
+      <w:numFmt w:val="lowerLetter"/>
+      <w:lvlText w:val="%8."/>
+      <w:lvlJc w:val="left"/>
+      <w:pPr>
+        <w:ind w:left="6120" w:hanging="360"/>
+      </w:pPr>
+    </w:lvl>
+    <w:lvl w:ilvl="8" w:tplc="0409001B" w:tentative="1">
+      <w:start w:val="1"/>
+      <w:numFmt w:val="lowerRoman"/>
+      <w:lvlText w:val="%9."/>
+      <w:lvlJc w:val="right"/>
+      <w:pPr>
+        <w:ind w:left="6840" w:hanging="180"/>
+      </w:pPr>
+    </w:lvl>
+  </w:abstractNum>
+  <w:abstractNum w:abstractNumId="14" w15:restartNumberingAfterBreak="0">
     <w:nsid w:val="5605544B"/>
     <w:multiLevelType w:val="multilevel"/>
     <w:tmpl w:val="F20A1CB0"/>
@@ -9107,7 +7916,7 @@
       </w:pPr>
     </w:lvl>
   </w:abstractNum>
-  <w:abstractNum w:abstractNumId="14" w15:restartNumberingAfterBreak="0">
+  <w:abstractNum w:abstractNumId="15" w15:restartNumberingAfterBreak="0">
     <w:nsid w:val="644577DD"/>
     <w:multiLevelType w:val="hybridMultilevel"/>
     <w:tmpl w:val="C46E2334"/>
@@ -9220,7 +8029,7 @@
       </w:rPr>
     </w:lvl>
   </w:abstractNum>
-  <w:abstractNum w:abstractNumId="15" w15:restartNumberingAfterBreak="0">
+  <w:abstractNum w:abstractNumId="16" w15:restartNumberingAfterBreak="0">
     <w:nsid w:val="78605E78"/>
     <w:multiLevelType w:val="hybridMultilevel"/>
     <w:tmpl w:val="D99024C6"/>
@@ -9334,7 +8143,7 @@
     </w:lvl>
   </w:abstractNum>
   <w:num w:numId="1" w16cid:durableId="405614271">
-    <w:abstractNumId w:val="13"/>
+    <w:abstractNumId w:val="14"/>
   </w:num>
   <w:num w:numId="2" w16cid:durableId="314263713">
     <w:abstractNumId w:val="6"/>
@@ -9361,7 +8170,7 @@
     <w:abstractNumId w:val="9"/>
   </w:num>
   <w:num w:numId="10" w16cid:durableId="2046784879">
-    <w:abstractNumId w:val="14"/>
+    <w:abstractNumId w:val="15"/>
   </w:num>
   <w:num w:numId="11" w16cid:durableId="1324359829">
     <w:abstractNumId w:val="5"/>
@@ -9376,10 +8185,13 @@
     <w:abstractNumId w:val="3"/>
   </w:num>
   <w:num w:numId="15" w16cid:durableId="240870759">
-    <w:abstractNumId w:val="15"/>
+    <w:abstractNumId w:val="16"/>
   </w:num>
   <w:num w:numId="16" w16cid:durableId="487208313">
     <w:abstractNumId w:val="12"/>
+  </w:num>
+  <w:num w:numId="17" w16cid:durableId="1636522302">
+    <w:abstractNumId w:val="13"/>
   </w:num>
 </w:numbering>
 </file>

</xml_diff>